<commit_message>
chore: update PRJ template placeholder document
</commit_message>
<xml_diff>
--- a/public/PRJ_Template_Placeholder.docx
+++ b/public/PRJ_Template_Placeholder.docx
@@ -1,6 +1,6 @@
 
 <file path=word/document.xml><?xml version="1.0" encoding="utf-8"?>
-<w:document xmlns:wpc="http://schemas.microsoft.com/office/word/2010/wordprocessingCanvas" xmlns:cx="http://schemas.microsoft.com/office/drawing/2014/chartex" xmlns:cx1="http://schemas.microsoft.com/office/drawing/2015/9/8/chartex" xmlns:cx2="http://schemas.microsoft.com/office/drawing/2015/10/21/chartex" xmlns:cx3="http://schemas.microsoft.com/office/drawing/2016/5/9/chartex" xmlns:cx4="http://schemas.microsoft.com/office/drawing/2016/5/10/chartex" xmlns:cx5="http://schemas.microsoft.com/office/drawing/2016/5/11/chartex" xmlns:cx6="http://schemas.microsoft.com/office/drawing/2016/5/12/chartex" xmlns:cx7="http://schemas.microsoft.com/office/drawing/2016/5/13/chartex" xmlns:cx8="http://schemas.microsoft.com/office/drawing/2016/5/14/chartex" xmlns:mc="http://schemas.openxmlformats.org/markup-compatibility/2006" xmlns:aink="http://schemas.microsoft.com/office/drawing/2016/ink" xmlns:am3d="http://schemas.microsoft.com/office/drawing/2017/model3d" xmlns:o="urn:schemas-microsoft-com:office:office" xmlns:oel="http://schemas.microsoft.com/office/2019/extlst" xmlns:r="http://schemas.openxmlformats.org/officeDocument/2006/relationships" xmlns:m="http://schemas.openxmlformats.org/officeDocument/2006/math" xmlns:v="urn:schemas-microsoft-com:vml" xmlns:wp14="http://schemas.microsoft.com/office/word/2010/wordprocessingDrawing" xmlns:wp="http://schemas.openxmlformats.org/drawingml/2006/wordprocessingDrawing" xmlns:w10="urn:schemas-microsoft-com:office:word" xmlns:w="http://schemas.openxmlformats.org/wordprocessingml/2006/main" xmlns:w14="http://schemas.microsoft.com/office/word/2010/wordml" xmlns:w15="http://schemas.microsoft.com/office/word/2012/wordml" xmlns:w16cex="http://schemas.microsoft.com/office/word/2018/wordml/cex" xmlns:w16cid="http://schemas.microsoft.com/office/word/2016/wordml/cid" xmlns:w16="http://schemas.microsoft.com/office/word/2018/wordml" xmlns:w16du="http://schemas.microsoft.com/office/word/2023/wordml/word16du" xmlns:w16sdtdh="http://schemas.microsoft.com/office/word/2020/wordml/sdtdatahash" xmlns:w16sdtfl="http://schemas.microsoft.com/office/word/2024/wordml/sdtformatlock" xmlns:w16se="http://schemas.microsoft.com/office/word/2015/wordml/symex" xmlns:wpg="http://schemas.microsoft.com/office/word/2010/wordprocessingGroup" xmlns:wpi="http://schemas.microsoft.com/office/word/2010/wordprocessingInk" xmlns:wne="http://schemas.microsoft.com/office/word/2006/wordml" xmlns:wps="http://schemas.microsoft.com/office/word/2010/wordprocessingShape" mc:Ignorable="w14 w15 w16se w16cid w16 w16cex w16sdtdh w16sdtfl w16du wp14">
+<w:document xmlns:wpc="http://schemas.microsoft.com/office/word/2010/wordprocessingCanvas" xmlns:cx="http://schemas.microsoft.com/office/drawing/2014/chartex" xmlns:cx1="http://schemas.microsoft.com/office/drawing/2015/9/8/chartex" xmlns:cx2="http://schemas.microsoft.com/office/drawing/2015/10/21/chartex" xmlns:cx3="http://schemas.microsoft.com/office/drawing/2016/5/9/chartex" xmlns:cx4="http://schemas.microsoft.com/office/drawing/2016/5/10/chartex" xmlns:cx5="http://schemas.microsoft.com/office/drawing/2016/5/11/chartex" xmlns:cx6="http://schemas.microsoft.com/office/drawing/2016/5/12/chartex" xmlns:cx7="http://schemas.microsoft.com/office/drawing/2016/5/13/chartex" xmlns:cx8="http://schemas.microsoft.com/office/drawing/2016/5/14/chartex" xmlns:mc="http://schemas.openxmlformats.org/markup-compatibility/2006" xmlns:aink="http://schemas.microsoft.com/office/drawing/2016/ink" xmlns:am3d="http://schemas.microsoft.com/office/drawing/2017/model3d" xmlns:o="urn:schemas-microsoft-com:office:office" xmlns:r="http://schemas.openxmlformats.org/officeDocument/2006/relationships" xmlns:m="http://schemas.openxmlformats.org/officeDocument/2006/math" xmlns:v="urn:schemas-microsoft-com:vml" xmlns:wp14="http://schemas.microsoft.com/office/word/2010/wordprocessingDrawing" xmlns:wp="http://schemas.openxmlformats.org/drawingml/2006/wordprocessingDrawing" xmlns:w10="urn:schemas-microsoft-com:office:word" xmlns:w="http://schemas.openxmlformats.org/wordprocessingml/2006/main" xmlns:w14="http://schemas.microsoft.com/office/word/2010/wordml" xmlns:w15="http://schemas.microsoft.com/office/word/2012/wordml" xmlns:w16cex="http://schemas.microsoft.com/office/word/2018/wordml/cex" xmlns:w16cid="http://schemas.microsoft.com/office/word/2016/wordml/cid" xmlns:w16="http://schemas.microsoft.com/office/word/2018/wordml" xmlns:w16sdtdh="http://schemas.microsoft.com/office/word/2020/wordml/sdtdatahash" xmlns:w16se="http://schemas.microsoft.com/office/word/2015/wordml/symex" xmlns:wpg="http://schemas.microsoft.com/office/word/2010/wordprocessingGroup" xmlns:wpi="http://schemas.microsoft.com/office/word/2010/wordprocessingInk" xmlns:wne="http://schemas.microsoft.com/office/word/2006/wordml" xmlns:wps="http://schemas.microsoft.com/office/word/2010/wordprocessingShape" mc:Ignorable="w14 w15 w16se w16cid w16 w16cex w16sdtdh wp14">
   <w:body>
     <w:p>
       <w:pPr>
@@ -26,7 +26,7 @@
           <w:szCs w:val="16"/>
           <w:highlight w:val="yellow"/>
         </w:rPr>
-        <w:t xml:space="preserve">{{offerLetterNoDate}}</w:t>
+        <w:t>{{offerLetterNoDate}}</w:t>
       </w:r>
     </w:p>
     <w:p>
@@ -138,7 +138,7 @@
           <w:szCs w:val="16"/>
           <w:highlight w:val="yellow"/>
         </w:rPr>
-        <w:t xml:space="preserve">PRJ.B- 7/LMAN/LMAN.4/2026</w:t>
+        <w:t>PRJ.B- 7/LMAN/LMAN.4/2026</w:t>
       </w:r>
     </w:p>
     <w:p>
@@ -162,8 +162,29 @@
           <w:szCs w:val="16"/>
         </w:rPr>
         <w:tab/>
+      </w:r>
+      <w:r>
+        <w:rPr>
+          <w:rFonts w:ascii="Arial" w:eastAsia="Arial" w:hAnsi="Arial" w:cs="Arial"/>
+          <w:sz w:val="16"/>
+          <w:szCs w:val="16"/>
+        </w:rPr>
         <w:tab/>
+      </w:r>
+      <w:r>
+        <w:rPr>
+          <w:rFonts w:ascii="Arial" w:eastAsia="Arial" w:hAnsi="Arial" w:cs="Arial"/>
+          <w:sz w:val="16"/>
+          <w:szCs w:val="16"/>
+        </w:rPr>
         <w:tab/>
+      </w:r>
+      <w:r>
+        <w:rPr>
+          <w:rFonts w:ascii="Arial" w:eastAsia="Arial" w:hAnsi="Arial" w:cs="Arial"/>
+          <w:sz w:val="16"/>
+          <w:szCs w:val="16"/>
+        </w:rPr>
         <w:tab/>
         <w:t xml:space="preserve">   </w:t>
       </w:r>
@@ -184,7 +205,16 @@
           <w:sz w:val="16"/>
           <w:szCs w:val="16"/>
         </w:rPr>
-        <w:t xml:space="preserve">Perjanjian SEWA GUNA Barang Milik Negara ini (selanjutnya disebut ”</w:t>
+        <w:t xml:space="preserve">Perjanjian SEWA GUNA Barang Milik Negara ini (selanjutnya </w:t>
+      </w:r>
+      <w:proofErr w:type="gramStart"/>
+      <w:r>
+        <w:rPr>
+          <w:rFonts w:ascii="Arial" w:eastAsia="Arial" w:hAnsi="Arial" w:cs="Arial"/>
+          <w:sz w:val="16"/>
+          <w:szCs w:val="16"/>
+        </w:rPr>
+        <w:t>disebut ”</w:t>
       </w:r>
       <w:r>
         <w:rPr>
@@ -196,13 +226,32 @@
         </w:rPr>
         <w:t>PERJANJIAN</w:t>
       </w:r>
-      <w:r>
-        <w:rPr>
-          <w:rFonts w:ascii="Arial" w:eastAsia="Arial" w:hAnsi="Arial" w:cs="Arial"/>
-          <w:sz w:val="16"/>
-          <w:szCs w:val="16"/>
-        </w:rPr>
-        <w:t xml:space="preserve">”) dibuat dan ditandatangani di Jakarta pada hari </w:t>
+      <w:proofErr w:type="gramEnd"/>
+      <w:r>
+        <w:rPr>
+          <w:rFonts w:ascii="Arial" w:eastAsia="Arial" w:hAnsi="Arial" w:cs="Arial"/>
+          <w:sz w:val="16"/>
+          <w:szCs w:val="16"/>
+        </w:rPr>
+        <w:t xml:space="preserve">”) dibuat dan ditandatangani di Jakarta pada </w:t>
+      </w:r>
+      <w:proofErr w:type="spellStart"/>
+      <w:r>
+        <w:rPr>
+          <w:rFonts w:ascii="Arial" w:eastAsia="Arial" w:hAnsi="Arial" w:cs="Arial"/>
+          <w:sz w:val="16"/>
+          <w:szCs w:val="16"/>
+        </w:rPr>
+        <w:t>hari</w:t>
+      </w:r>
+      <w:proofErr w:type="spellEnd"/>
+      <w:r>
+        <w:rPr>
+          <w:rFonts w:ascii="Arial" w:eastAsia="Arial" w:hAnsi="Arial" w:cs="Arial"/>
+          <w:sz w:val="16"/>
+          <w:szCs w:val="16"/>
+        </w:rPr>
+        <w:t xml:space="preserve"> </w:t>
       </w:r>
       <w:r>
         <w:rPr>
@@ -211,16 +260,9 @@
           <w:szCs w:val="16"/>
           <w:highlight w:val="yellow"/>
         </w:rPr>
-        <w:t xml:space="preserve">{{signatureDateWords}}</w:t>
-      </w:r>
-      <w:r>
-        <w:rPr>
-          <w:rFonts w:ascii="Arial" w:eastAsia="Arial" w:hAnsi="Arial" w:cs="Arial"/>
-          <w:sz w:val="16"/>
-          <w:szCs w:val="16"/>
-        </w:rPr>
-        <w:t xml:space="preserve"> sebagaimana Surat Penawaran Harga nomor </w:t>
-      </w:r>
+        <w:t>{{</w:t>
+      </w:r>
+      <w:proofErr w:type="spellStart"/>
       <w:r>
         <w:rPr>
           <w:rFonts w:ascii="Arial" w:eastAsia="Arial" w:hAnsi="Arial" w:cs="Arial"/>
@@ -228,7 +270,70 @@
           <w:szCs w:val="16"/>
           <w:highlight w:val="yellow"/>
         </w:rPr>
-        <w:t xml:space="preserve">{{offerLetterNoDate}}</w:t>
+        <w:t>offerLetterDateWords</w:t>
+      </w:r>
+      <w:proofErr w:type="spellEnd"/>
+      <w:r>
+        <w:rPr>
+          <w:rFonts w:ascii="Arial" w:eastAsia="Arial" w:hAnsi="Arial" w:cs="Arial"/>
+          <w:sz w:val="16"/>
+          <w:szCs w:val="16"/>
+          <w:highlight w:val="yellow"/>
+        </w:rPr>
+        <w:t>}}</w:t>
+      </w:r>
+      <w:r>
+        <w:rPr>
+          <w:rFonts w:ascii="Arial" w:eastAsia="Arial" w:hAnsi="Arial" w:cs="Arial"/>
+          <w:sz w:val="16"/>
+          <w:szCs w:val="16"/>
+        </w:rPr>
+        <w:t xml:space="preserve"> </w:t>
+      </w:r>
+      <w:proofErr w:type="spellStart"/>
+      <w:r>
+        <w:rPr>
+          <w:rFonts w:ascii="Arial" w:eastAsia="Arial" w:hAnsi="Arial" w:cs="Arial"/>
+          <w:sz w:val="16"/>
+          <w:szCs w:val="16"/>
+        </w:rPr>
+        <w:t>sebagaimana</w:t>
+      </w:r>
+      <w:proofErr w:type="spellEnd"/>
+      <w:r>
+        <w:rPr>
+          <w:rFonts w:ascii="Arial" w:eastAsia="Arial" w:hAnsi="Arial" w:cs="Arial"/>
+          <w:sz w:val="16"/>
+          <w:szCs w:val="16"/>
+        </w:rPr>
+        <w:t xml:space="preserve"> Surat </w:t>
+      </w:r>
+      <w:proofErr w:type="spellStart"/>
+      <w:r>
+        <w:rPr>
+          <w:rFonts w:ascii="Arial" w:eastAsia="Arial" w:hAnsi="Arial" w:cs="Arial"/>
+          <w:sz w:val="16"/>
+          <w:szCs w:val="16"/>
+        </w:rPr>
+        <w:t>Penawaran</w:t>
+      </w:r>
+      <w:proofErr w:type="spellEnd"/>
+      <w:r>
+        <w:rPr>
+          <w:rFonts w:ascii="Arial" w:eastAsia="Arial" w:hAnsi="Arial" w:cs="Arial"/>
+          <w:sz w:val="16"/>
+          <w:szCs w:val="16"/>
+        </w:rPr>
+        <w:t xml:space="preserve"> Harga nomor </w:t>
+      </w:r>
+      <w:r>
+        <w:rPr>
+          <w:rFonts w:ascii="Arial" w:eastAsia="Arial" w:hAnsi="Arial" w:cs="Arial"/>
+          <w:sz w:val="16"/>
+          <w:szCs w:val="16"/>
+          <w:highlight w:val="yellow"/>
+        </w:rPr>
+        <w:t>{{offerLetterNoDate}}</w:t>
       </w:r>
       <w:r>
         <w:rPr>
@@ -255,7 +360,7 @@
           <w:sz w:val="16"/>
           <w:szCs w:val="16"/>
         </w:rPr>
-        <w:t xml:space="preserve">oleh dan antara pihak-pihak sebagai berikut:</w:t>
+        <w:t>oleh dan antara pihak-pihak sebagai berikut:</w:t>
       </w:r>
     </w:p>
     <w:p>
@@ -291,7 +396,7 @@
           <w:sz w:val="16"/>
           <w:szCs w:val="16"/>
         </w:rPr>
-        <w:t xml:space="preserve">Lembaga Manajemen Aset Negara-Kementerian Keuangan Republik Indonesia, satuan kerja di lingkungan Direktorat Jenderal Kekayaan Negara Kementerian Keuangan yang memiliki tugas dan fungsi untuk menyelenggarakan pengelolaan aset berdasarkan keputusan Menteri Keuangan Nomor 1319/KMK.05/2015 tanggal 30 Desember 2015 tentang Penetapan Lembaga Manajemen Aset Negara pada Kementerian Keuangan sebagai Instansi Pemerintah yang Menerapkan Pengelolaan Keuangan Badan Layanan Umum, berkedudukan di Jalan Pangeran Diponegoro No.62A, Pegangsaan, Jakarta Pusat 10320, dalam hal ini diwakili oleh:</w:t>
+        <w:t>Lembaga Manajemen Aset Negara-Kementerian Keuangan Republik Indonesia, satuan kerja di lingkungan Direktorat Jenderal Kekayaan Negara Kementerian Keuangan yang memiliki tugas dan fungsi untuk menyelenggarakan pengelolaan aset berdasarkan keputusan Menteri Keuangan Nomor 1319/KMK.05/2015 tanggal 30 Desember 2015 tentang Penetapan Lembaga Manajemen Aset Negara pada Kementerian Keuangan sebagai Instansi Pemerintah yang Menerapkan Pengelolaan Keuangan Badan Layanan Umum, berkedudukan di Jalan Pangeran Diponegoro No.62A, Pegangsaan, Jakarta Pusat 10320, dalam hal ini diwakili oleh:</w:t>
       </w:r>
     </w:p>
     <w:p>
@@ -343,7 +448,7 @@
           <w:sz w:val="16"/>
           <w:szCs w:val="16"/>
         </w:rPr>
-        <w:t xml:space="preserve">{{officialTitle}}, untuk selanjutnya disebut sebagai "PIHAK PERTAMA".</w:t>
+        <w:t>{{officialTitle}}, untuk selanjutnya disebut sebagai "PIHAK PERTAMA".</w:t>
       </w:r>
     </w:p>
     <w:p>
@@ -396,7 +501,7 @@
           <w:szCs w:val="16"/>
           <w:highlight w:val="yellow"/>
         </w:rPr>
-        <w:t xml:space="preserve">{{signatoryTitle}}</w:t>
+        <w:t>{{signatoryTitle}}</w:t>
       </w:r>
       <w:r>
         <w:rPr>
@@ -424,7 +529,7 @@
           <w:sz w:val="16"/>
           <w:szCs w:val="16"/>
         </w:rPr>
-        <w:t xml:space="preserve">PIHAK PERTAMA dan PIHAK KEDUA secara sendiri-sendiri dapat disebut sebagai “PIHAK” dan secara bersama-sama selanjutnya dalam PERJANJIAN ini disebut "PARA PIHAK".</w:t>
+        <w:t>PIHAK PERTAMA dan PIHAK KEDUA secara sendiri-sendiri dapat disebut sebagai “PIHAK” dan secara bersama-sama selanjutnya dalam PERJANJIAN ini disebut "PARA PIHAK".</w:t>
       </w:r>
     </w:p>
     <w:p>
@@ -443,7 +548,7 @@
           <w:sz w:val="16"/>
           <w:szCs w:val="16"/>
         </w:rPr>
-        <w:t xml:space="preserve">Terlebih dahulu PARA PIHAK menerangkan hal-hal sebagai berikut:</w:t>
+        <w:t>Terlebih dahulu PARA PIHAK menerangkan hal-hal sebagai berikut:</w:t>
       </w:r>
     </w:p>
     <w:p>
@@ -476,7 +581,7 @@
           <w:sz w:val="16"/>
           <w:szCs w:val="16"/>
         </w:rPr>
-        <w:t xml:space="preserve">Menteri Keuangan Republik Indonesia merupakan Pengelola Barang atas Barang Milik Negara pada PIHAK PERTAMA dan telah melakukan pelimpahan kewenangan kepada pejabat struktural di lingkungan PIHAK PERTAMA dalam bentuk mandat.</w:t>
+        <w:t>Menteri Keuangan Republik Indonesia merupakan Pengelola Barang atas Barang Milik Negara pada PIHAK PERTAMA dan telah melakukan pelimpahan kewenangan kepada pejabat struktural di lingkungan PIHAK PERTAMA dalam bentuk mandat.</w:t>
       </w:r>
     </w:p>
     <w:p>
@@ -519,7 +624,7 @@
           <w:szCs w:val="16"/>
           <w:highlight w:val="yellow"/>
         </w:rPr>
-        <w:t xml:space="preserve">{{applicationLetterNo}} tanggal {{applicationLetterDate}}</w:t>
+        <w:t>{{applicationLetterNo}} tanggal {{applicationLetterDate}}</w:t>
       </w:r>
       <w:r>
         <w:rPr>
@@ -571,7 +676,7 @@
           <w:szCs w:val="16"/>
           <w:highlight w:val="yellow"/>
         </w:rPr>
-        <w:t xml:space="preserve">{{offerLetterNoDate}}</w:t>
+        <w:t>{{offerLetterNoDate}}</w:t>
       </w:r>
       <w:r>
         <w:rPr>
@@ -590,7 +695,7 @@
           <w:szCs w:val="16"/>
           <w:highlight w:val="yellow"/>
         </w:rPr>
-        <w:t xml:space="preserve">Persetujuan Penawaran Sewa Guna atas Gedung A.A. Maramis untuk Kegiatan {{eventName}}</w:t>
+        <w:t>Persetujuan Penawaran Sewa Guna atas Gedung A.A. Maramis untuk Kegiatan {{eventName}}</w:t>
       </w:r>
       <w:r>
         <w:rPr>
@@ -618,7 +723,7 @@
           <w:sz w:val="16"/>
           <w:szCs w:val="16"/>
         </w:rPr>
-        <w:t xml:space="preserve">Bahwa PARA PIHAK mempertimbangkan pula ketentuan-ketentuan dalam:</w:t>
+        <w:t>Bahwa PARA PIHAK mempertimbangkan pula ketentuan-ketentuan dalam:</w:t>
       </w:r>
     </w:p>
     <w:p>
@@ -652,7 +757,7 @@
           <w:sz w:val="16"/>
           <w:szCs w:val="16"/>
         </w:rPr>
-        <w:t xml:space="preserve">Undang-Undang Nomor 11 Tahun 2020 tentang Cagar Budaya;</w:t>
+        <w:t>Undang-Undang Nomor 11 Tahun 2020 tentang Cagar Budaya;</w:t>
       </w:r>
     </w:p>
     <w:p>
@@ -686,7 +791,7 @@
           <w:sz w:val="16"/>
           <w:szCs w:val="16"/>
         </w:rPr>
-        <w:t xml:space="preserve">Peraturan Pemerintah Nomor 1 Tahun 2022 tentang Register Nasional dan Pelestarian Cagar Budaya;</w:t>
+        <w:t>Peraturan Pemerintah Nomor 1 Tahun 2022 tentang Register Nasional dan Pelestarian Cagar Budaya;</w:t>
       </w:r>
     </w:p>
     <w:p>
@@ -720,7 +825,7 @@
           <w:sz w:val="16"/>
           <w:szCs w:val="16"/>
         </w:rPr>
-        <w:t xml:space="preserve">Peraturan Menteri Pekerjaan Umum dan Perumahan Rakyat Nomor 19 Tahun 2021 tentang Pedoman Teknis Penyelenggaraan Bangunan Gedung Cagar Budaya yang Dilestarikan.</w:t>
+        <w:t>Peraturan Menteri Pekerjaan Umum dan Perumahan Rakyat Nomor 19 Tahun 2021 tentang Pedoman Teknis Penyelenggaraan Bangunan Gedung Cagar Budaya yang Dilestarikan.</w:t>
       </w:r>
     </w:p>
     <w:p>
@@ -754,7 +859,7 @@
           <w:sz w:val="16"/>
           <w:szCs w:val="16"/>
         </w:rPr>
-        <w:t xml:space="preserve">Peraturan Menteri Keuangan Nomor 144/PMK.06/2020 tentang Pengelolaan Barang Milik Negara Oleh Badan Layanan Umum Lembaga Manajemen Aset Negara;</w:t>
+        <w:t>Peraturan Menteri Keuangan Nomor 144/PMK.06/2020 tentang Pengelolaan Barang Milik Negara Oleh Badan Layanan Umum Lembaga Manajemen Aset Negara;</w:t>
       </w:r>
     </w:p>
     <w:p>
@@ -787,7 +892,7 @@
           <w:sz w:val="16"/>
           <w:szCs w:val="16"/>
         </w:rPr>
-        <w:t xml:space="preserve">Keputusan Menteri Keuangan Nomor 1319/KMK.05/2015 tentang Penetapan Lembaga Manajemen Aset Negara pada Kementerian Keuangan Sebagai Instansi Pemerintah yang Menerapkan Pengelolaan Keuangan Badan Layanan Umum;</w:t>
+        <w:t>Keputusan Menteri Keuangan Nomor 1319/KMK.05/2015 tentang Penetapan Lembaga Manajemen Aset Negara pada Kementerian Keuangan Sebagai Instansi Pemerintah yang Menerapkan Pengelolaan Keuangan Badan Layanan Umum;</w:t>
       </w:r>
     </w:p>
     <w:p>
@@ -820,7 +925,7 @@
           <w:sz w:val="16"/>
           <w:szCs w:val="16"/>
         </w:rPr>
-        <w:t xml:space="preserve">Berdasarkan Keputusan Direktur Jenderal Kekayaan Negara Nomor Kep-117/KN/2023 tanggal 31 Juli 2023 tentang Penyerahkelolaan Barang Milik Negara pada Pengelola Barang kepada Lembaga Manajemen Aset Negara;</w:t>
+        <w:t>Berdasarkan Keputusan Direktur Jenderal Kekayaan Negara Nomor Kep-117/KN/2023 tanggal 31 Juli 2023 tentang Penyerahkelolaan Barang Milik Negara pada Pengelola Barang kepada Lembaga Manajemen Aset Negara;</w:t>
       </w:r>
     </w:p>
     <w:p>
@@ -852,7 +957,7 @@
           <w:sz w:val="16"/>
           <w:szCs w:val="16"/>
         </w:rPr>
-        <w:t xml:space="preserve">Keputusan Direktur Lembaga Manajemen Aset Negara Nomor 45/LMAN/2025 tentang Pelimpahan Sebagian Kewenangan Direktur Utama Dalam Bentuk Mandat Kepada Direktur Dan Kepala Divisi Di Lingkungan Lembaga Manajemen Aset Negara Untuk Dan Atas nama Direktur Utama Lembaga Manajemen Aset Negara Mendandatangani Dokumen Dalam Rangka Pelaksanaan Tugas Dan Fungsi</w:t>
+        <w:t>Keputusan Direktur Lembaga Manajemen Aset Negara Nomor 45/LMAN/2025 tentang Pelimpahan Sebagian Kewenangan Direktur Utama Dalam Bentuk Mandat Kepada Direktur Dan Kepala Divisi Di Lingkungan Lembaga Manajemen Aset Negara Untuk Dan Atas nama Direktur Utama Lembaga Manajemen Aset Negara Mendandatangani Dokumen Dalam Rangka Pelaksanaan Tugas Dan Fungsi</w:t>
       </w:r>
       <w:r>
         <w:rPr>
@@ -880,7 +985,7 @@
           <w:sz w:val="16"/>
           <w:szCs w:val="16"/>
         </w:rPr>
-        <w:t xml:space="preserve">Berdasarkan hal-hal tersebut di atas, PARA PIHAK menyatakan telah sepakat dan setuju untuk mengikatkan diri dalam PERJANJIAN ini, dengan ketentuan dan syarat-syarat sebagaimana tercantum dalam pasal-pasal di bawah ini:</w:t>
+        <w:t>Berdasarkan hal-hal tersebut di atas, PARA PIHAK menyatakan telah sepakat dan setuju untuk mengikatkan diri dalam PERJANJIAN ini, dengan ketentuan dan syarat-syarat sebagaimana tercantum dalam pasal-pasal di bawah ini:</w:t>
       </w:r>
     </w:p>
     <w:p>
@@ -982,7 +1087,7 @@
           <w:sz w:val="16"/>
           <w:szCs w:val="16"/>
         </w:rPr>
-        <w:t xml:space="preserve">Tujuan PERJANJIAN ini adalah dalam rangka tertib administrasi pengelolaan Barang Milik Negara oleh PIHAK PERTAMA dengan memperhatikan manfaat ekonomi dan/atau manfaat sosial bagi masyarakat.</w:t>
+        <w:t>Tujuan PERJANJIAN ini adalah dalam rangka tertib administrasi pengelolaan Barang Milik Negara oleh PIHAK PERTAMA dengan memperhatikan manfaat ekonomi dan/atau manfaat sosial bagi masyarakat.</w:t>
       </w:r>
     </w:p>
     <w:p>
@@ -1048,17 +1153,15 @@
           <w:szCs w:val="16"/>
           <w:highlight w:val="yellow"/>
         </w:rPr>
-        <w:t xml:space="preserve">{{objectDescription}}</w:t>
-      </w:r>
-      <w:r>
-        <w:rPr>
-          <w:rFonts w:ascii="Arial" w:eastAsia="Arial" w:hAnsi="Arial" w:cs="Arial"/>
-          <w:sz w:val="16"/>
-          <w:szCs w:val="16"/>
-        </w:rPr>
-        <w:t xml:space="preserve"> persegi di Jalan Lapangan </w:t>
-        <w:lastRenderedPageBreak/>
-        <w:t xml:space="preserve">Banteng Timur Nomor 2-4, Jakarta Pusat selanjutnya disebut “OBJEK SEWA GUNA”.</w:t>
+        <w:t>{{objectDescription}}</w:t>
+      </w:r>
+      <w:r>
+        <w:rPr>
+          <w:rFonts w:ascii="Arial" w:eastAsia="Arial" w:hAnsi="Arial" w:cs="Arial"/>
+          <w:sz w:val="16"/>
+          <w:szCs w:val="16"/>
+        </w:rPr>
+        <w:t xml:space="preserve"> persegi di Jalan Lapangan Banteng Timur Nomor 2-4, Jakarta Pusat selanjutnya disebut “OBJEK SEWA GUNA”.</w:t>
       </w:r>
     </w:p>
     <w:p>
@@ -1139,7 +1242,7 @@
           <w:szCs w:val="16"/>
           <w:highlight w:val="yellow"/>
         </w:rPr>
-        <w:t xml:space="preserve">{{eventName}}</w:t>
+        <w:t>{{eventName}}</w:t>
       </w:r>
       <w:r>
         <w:rPr>
@@ -1181,7 +1284,7 @@
           <w:sz w:val="16"/>
           <w:szCs w:val="16"/>
         </w:rPr>
-        <w:t xml:space="preserve">PERJANJIAN ini tidak mengubah atau mengalihkan hak kepemilikan PIHAK PERTAMA sebagai pengelola yang sah atas OBJEK SEWA GUNA.</w:t>
+        <w:t>PERJANJIAN ini tidak mengubah atau mengalihkan hak kepemilikan PIHAK PERTAMA sebagai pengelola yang sah atas OBJEK SEWA GUNA.</w:t>
       </w:r>
     </w:p>
     <w:p>
@@ -1214,7 +1317,7 @@
           <w:sz w:val="16"/>
           <w:szCs w:val="16"/>
         </w:rPr>
-        <w:t xml:space="preserve">PIHAK KEDUA dilarang untuk melakukan pemindahtanganan, meminjampakaikan, melakukan SEWA GUNA kembali tanpa persetujuan tertulis PIHAK PERTAMA, atau menjadikan sebagai jaminan sebagian dan/atau seluruh OBJEK SEWA GUNA.</w:t>
+        <w:t>PIHAK KEDUA dilarang untuk melakukan pemindahtanganan, meminjampakaikan, melakukan SEWA GUNA kembali tanpa persetujuan tertulis PIHAK PERTAMA, atau menjadikan sebagai jaminan sebagian dan/atau seluruh OBJEK SEWA GUNA.</w:t>
       </w:r>
     </w:p>
     <w:p>
@@ -1233,6 +1336,7 @@
           <w:sz w:val="16"/>
           <w:szCs w:val="16"/>
         </w:rPr>
+        <w:lastRenderedPageBreak/>
         <w:t>PASAL 4</w:t>
       </w:r>
     </w:p>
@@ -1285,7 +1389,7 @@
           <w:sz w:val="16"/>
           <w:szCs w:val="16"/>
         </w:rPr>
-        <w:t xml:space="preserve">PIHAK KEDUA bertanggung jawab terhadap pemeliharaan dan pengamanan OBJEK SEWA GUNA berikut biaya yang ditimbulkan selama JANGKA WAKTU SEWA GUNA sampai dengan penyerahan kembali OBJEK SEWA GUNA kepada PIHAK PERTAMA.</w:t>
+        <w:t>PIHAK KEDUA bertanggung jawab terhadap pemeliharaan dan pengamanan OBJEK SEWA GUNA berikut biaya yang ditimbulkan selama JANGKA WAKTU SEWA GUNA sampai dengan penyerahan kembali OBJEK SEWA GUNA kepada PIHAK PERTAMA.</w:t>
       </w:r>
     </w:p>
     <w:p>
@@ -1318,7 +1422,7 @@
           <w:sz w:val="16"/>
           <w:szCs w:val="16"/>
         </w:rPr>
-        <w:t xml:space="preserve">PIHAK KEDUA bertanggung jawab atas segala kerugian yang diderita PIHAK PERTAMA yang timbul dari pelanggaran atas dan/atau tidak dilaksanakannya ketentuan PERJANJIAN ini, atau yang timbul dari kesalahan atau kelalaian PIHAK KEDUA dalam pelaksanaan PERJANJIAN ini.</w:t>
+        <w:t>PIHAK KEDUA bertanggung jawab atas segala kerugian yang diderita PIHAK PERTAMA yang timbul dari pelanggaran atas dan/atau tidak dilaksanakannya ketentuan PERJANJIAN ini, atau yang timbul dari kesalahan atau kelalaian PIHAK KEDUA dalam pelaksanaan PERJANJIAN ini.</w:t>
       </w:r>
     </w:p>
     <w:p>
@@ -1351,7 +1455,7 @@
           <w:sz w:val="16"/>
           <w:szCs w:val="16"/>
         </w:rPr>
-        <w:t xml:space="preserve">PIHAK KEDUA menyediakan segala kebutuhan operasional yang diperlukan untuk kepentingan pelaksanaan SEWA GUNA.</w:t>
+        <w:t>PIHAK KEDUA menyediakan segala kebutuhan operasional yang diperlukan untuk kepentingan pelaksanaan SEWA GUNA.</w:t>
       </w:r>
     </w:p>
     <w:p>
@@ -1422,7 +1526,7 @@
           <w:sz w:val="16"/>
           <w:szCs w:val="16"/>
         </w:rPr>
-        <w:t xml:space="preserve">Selain hak yang tercantum di bagian lain dalam PERJANJIAN ini, PIHAK PERTAMA memiliki hak dan mendapatkan persetujuan berdasarkan PERJANJIAN ini, sebagai berikut:</w:t>
+        <w:t>Selain hak yang tercantum di bagian lain dalam PERJANJIAN ini, PIHAK PERTAMA memiliki hak dan mendapatkan persetujuan berdasarkan PERJANJIAN ini, sebagai berikut:</w:t>
       </w:r>
     </w:p>
     <w:p>
@@ -1455,7 +1559,7 @@
           <w:sz w:val="16"/>
           <w:szCs w:val="16"/>
         </w:rPr>
-        <w:t xml:space="preserve">Menerima pembayaran uang SEWA GUNA atas pemanfaatan OBJEK SEWA GUNA oleh PIHAK KEDUA sebagaimana diatur dalam PERJANJIAN ini.</w:t>
+        <w:t>Menerima pembayaran uang SEWA GUNA atas pemanfaatan OBJEK SEWA GUNA oleh PIHAK KEDUA sebagaimana diatur dalam PERJANJIAN ini.</w:t>
       </w:r>
     </w:p>
     <w:p>
@@ -1488,7 +1592,7 @@
           <w:sz w:val="16"/>
           <w:szCs w:val="16"/>
         </w:rPr>
-        <w:t xml:space="preserve">Melakukan pengawasan dan pengendalian terhadap pelaksanaan PERJANJIAN ini, baik secara berkala maupun sewaktu-waktu.</w:t>
+        <w:t>Melakukan pengawasan dan pengendalian terhadap pelaksanaan PERJANJIAN ini, baik secara berkala maupun sewaktu-waktu.</w:t>
       </w:r>
     </w:p>
     <w:p>
@@ -1521,7 +1625,7 @@
           <w:sz w:val="16"/>
           <w:szCs w:val="16"/>
         </w:rPr>
-        <w:t xml:space="preserve">Meminta secara tertulis kepada PIHAK KEDUA untuk melakukan penyesuaian atau pemblokiran akses penggunaan/pemanfaatan OBJEK SEWA GUNA, baik sebagian maupun seluruhnya, dalam hal PIHAK KEDUA melakukan hal-hal yang tidak sesuai dengan PERJANJIAN ini dan/atau ketentuan peraturan perundang-undangan.</w:t>
+        <w:t>Meminta secara tertulis kepada PIHAK KEDUA untuk melakukan penyesuaian atau pemblokiran akses penggunaan/pemanfaatan OBJEK SEWA GUNA, baik sebagian maupun seluruhnya, dalam hal PIHAK KEDUA melakukan hal-hal yang tidak sesuai dengan PERJANJIAN ini dan/atau ketentuan peraturan perundang-undangan.</w:t>
       </w:r>
     </w:p>
     <w:p>
@@ -1554,7 +1658,7 @@
           <w:sz w:val="16"/>
           <w:szCs w:val="16"/>
         </w:rPr>
-        <w:t xml:space="preserve">Menyetujui atau menolak permohonan perpanjangan SEWA GUNA berdasarkan hasil penelitian atas pelaksanaan PERJANJIAN ini.</w:t>
+        <w:t>Menyetujui atau menolak permohonan perpanjangan SEWA GUNA berdasarkan hasil penelitian atas pelaksanaan PERJANJIAN ini.</w:t>
       </w:r>
     </w:p>
     <w:p>
@@ -1587,7 +1691,7 @@
           <w:sz w:val="16"/>
           <w:szCs w:val="16"/>
         </w:rPr>
-        <w:t xml:space="preserve">Mengenakan sanksi kepada PIHAK KEDUA atas pelanggaran yang dilakukan PIHAK KEDUA terhadap PERJANJIAN ini.</w:t>
+        <w:t>Mengenakan sanksi kepada PIHAK KEDUA atas pelanggaran yang dilakukan PIHAK KEDUA terhadap PERJANJIAN ini.</w:t>
       </w:r>
     </w:p>
     <w:p>
@@ -1620,7 +1724,7 @@
           <w:sz w:val="16"/>
           <w:szCs w:val="16"/>
         </w:rPr>
-        <w:t xml:space="preserve">Menerima kembali OBJEK SEWA GUNA dari PIHAK KEDUA</w:t>
+        <w:t>Menerima kembali OBJEK SEWA GUNA dari PIHAK KEDUA</w:t>
       </w:r>
       <w:r>
         <w:rPr>
@@ -1638,7 +1742,7 @@
           <w:sz w:val="16"/>
           <w:szCs w:val="16"/>
         </w:rPr>
-        <w:t xml:space="preserve">dalam kondisi baik dan layak fungsi dengan mempertimbangkan perubahan OBJEK SEWA GUNA dari kondisi awal, keadaan kahar, dan/atau standarisasi pelaksanaan pemeliharaan yang dilakukan PIHAK KEDUA, pada saat PERJANJIAN ini berakhir dengan berita acara.</w:t>
+        <w:t>dalam kondisi baik dan layak fungsi dengan mempertimbangkan perubahan OBJEK SEWA GUNA dari kondisi awal, keadaan kahar, dan/atau standarisasi pelaksanaan pemeliharaan yang dilakukan PIHAK KEDUA, pada saat PERJANJIAN ini berakhir dengan berita acara.</w:t>
       </w:r>
     </w:p>
     <w:p>
@@ -1671,7 +1775,7 @@
           <w:sz w:val="16"/>
           <w:szCs w:val="16"/>
         </w:rPr>
-        <w:t xml:space="preserve">Melakukan pengosongan apabila PIHAK KEDUA tidak memenuhi kewajiban sebagaimana dimaksud dalam Pasal 5.1.3.</w:t>
+        <w:t>Melakukan pengosongan apabila PIHAK KEDUA tidak memenuhi kewajiban sebagaimana dimaksud dalam Pasal 5.1.3.</w:t>
       </w:r>
     </w:p>
     <w:p>
@@ -1704,7 +1808,7 @@
           <w:sz w:val="16"/>
           <w:szCs w:val="16"/>
         </w:rPr>
-        <w:t xml:space="preserve">Selain kewajiban yang tercantum di bagian lain dalam PERJANJIAN ini, PIHAK PERTAMA memiliki kewajiban untuk menyerahkan OBJEK SEWA GUNA kepada PIHAK KEDUA dalam rangka pelaksanaan PERJANJIAN ini.</w:t>
+        <w:t>Selain kewajiban yang tercantum di bagian lain dalam PERJANJIAN ini, PIHAK PERTAMA memiliki kewajiban untuk menyerahkan OBJEK SEWA GUNA kepada PIHAK KEDUA dalam rangka pelaksanaan PERJANJIAN ini.</w:t>
       </w:r>
     </w:p>
     <w:p>
@@ -1737,7 +1841,7 @@
           <w:sz w:val="16"/>
           <w:szCs w:val="16"/>
         </w:rPr>
-        <w:t xml:space="preserve">Selain hak yang tercantum di bagian lain dalam PERJANJIAN ini, PIHAK KEDUA memiliki hak, sebagai berikut:</w:t>
+        <w:t>Selain hak yang tercantum di bagian lain dalam PERJANJIAN ini, PIHAK KEDUA memiliki hak, sebagai berikut:</w:t>
       </w:r>
     </w:p>
     <w:p>
@@ -1770,7 +1874,7 @@
           <w:sz w:val="16"/>
           <w:szCs w:val="16"/>
         </w:rPr>
-        <w:t xml:space="preserve">Menerima penyerahan OBJEK SEWA GUNA dari PIHAK PERTAMA.</w:t>
+        <w:t>Menerima penyerahan OBJEK SEWA GUNA dari PIHAK PERTAMA.</w:t>
       </w:r>
     </w:p>
     <w:p>
@@ -1803,7 +1907,7 @@
           <w:sz w:val="16"/>
           <w:szCs w:val="16"/>
         </w:rPr>
-        <w:t xml:space="preserve">Menggunakan dalam rangka pemanfaatan OBJEK SEWA GUNA sesuai dengan maksud dan tujuan serta ruang lingkup PERJANJIAN ini dan ketentuan peraturan perundang-undangan.</w:t>
+        <w:t>Menggunakan dalam rangka pemanfaatan OBJEK SEWA GUNA sesuai dengan maksud dan tujuan serta ruang lingkup PERJANJIAN ini dan ketentuan peraturan perundang-undangan.</w:t>
       </w:r>
     </w:p>
     <w:p>
@@ -1942,7 +2046,7 @@
           <w:sz w:val="16"/>
           <w:szCs w:val="16"/>
         </w:rPr>
-        <w:t xml:space="preserve">Selain kewajiban yang tercantum di bagian lain dalam PERJANJIAN ini, PIHAK KEDUA memiliki kewajiban, sebagai berikut:</w:t>
+        <w:t>Selain kewajiban yang tercantum di bagian lain dalam PERJANJIAN ini, PIHAK KEDUA memiliki kewajiban, sebagai berikut:</w:t>
       </w:r>
     </w:p>
     <w:p>
@@ -1975,7 +2079,7 @@
           <w:sz w:val="16"/>
           <w:szCs w:val="16"/>
         </w:rPr>
-        <w:t xml:space="preserve">Membayar uang SEWA GUNA sebagaimana diatur dalam PERJANJIAN ini.</w:t>
+        <w:t>Membayar uang SEWA GUNA sebagaimana diatur dalam PERJANJIAN ini.</w:t>
       </w:r>
     </w:p>
     <w:p>
@@ -2008,7 +2112,7 @@
           <w:sz w:val="16"/>
           <w:szCs w:val="16"/>
         </w:rPr>
-        <w:t xml:space="preserve">Melakukan pengamanan dan pemeliharaan atas OBJEK SEWA GUNA sebagaimana maksud dan tujuan PERJANJIAN ini.</w:t>
+        <w:t>Melakukan pengamanan dan pemeliharaan atas OBJEK SEWA GUNA sebagaimana maksud dan tujuan PERJANJIAN ini.</w:t>
       </w:r>
     </w:p>
     <w:p>
@@ -2041,7 +2145,7 @@
           <w:sz w:val="16"/>
           <w:szCs w:val="16"/>
         </w:rPr>
-        <w:t xml:space="preserve">Menanggung sepenuhnya biaya yang dikeluarkan dalam kaitannya dengan pelaksanaan SEWA GUNA, kebersihan, pemeliharaan, dan pengamanan OBJEK SEWA GUNA selama JANGKA WAKTU SEWA.</w:t>
+        <w:t>Menanggung sepenuhnya biaya yang dikeluarkan dalam kaitannya dengan pelaksanaan SEWA GUNA, kebersihan, pemeliharaan, dan pengamanan OBJEK SEWA GUNA selama JANGKA WAKTU SEWA.</w:t>
       </w:r>
     </w:p>
     <w:p>
@@ -2074,7 +2178,7 @@
           <w:sz w:val="16"/>
           <w:szCs w:val="16"/>
         </w:rPr>
-        <w:t xml:space="preserve">Mematuhi tata tertib (</w:t>
+        <w:t>Mematuhi tata tertib (</w:t>
       </w:r>
       <w:r>
         <w:rPr>
@@ -2093,7 +2197,7 @@
           <w:sz w:val="16"/>
           <w:szCs w:val="16"/>
         </w:rPr>
-        <w:t xml:space="preserve">pemanfaatan OBJEK SEWA GUNA sebagaimana dimaksud dan ditautkan dalam Surat Penawaran Harga dan perubahannya.</w:t>
+        <w:t>pemanfaatan OBJEK SEWA GUNA sebagaimana dimaksud dan ditautkan dalam Surat Penawaran Harga dan perubahannya.</w:t>
       </w:r>
     </w:p>
     <w:p>
@@ -2126,7 +2230,7 @@
           <w:sz w:val="16"/>
           <w:szCs w:val="16"/>
         </w:rPr>
-        <w:t xml:space="preserve">Mengajukan permohonan tertulis kepada PIHAK PERTAMA untuk kepentingan perpanjangan JANGKA WAKTU SEWA GUNA paling lambat 2 (dua) hari kerja sebelum Perjanjian berakhir.</w:t>
+        <w:t>Mengajukan permohonan tertulis kepada PIHAK PERTAMA untuk kepentingan perpanjangan JANGKA WAKTU SEWA GUNA paling lambat 2 (dua) hari kerja sebelum Perjanjian berakhir.</w:t>
       </w:r>
     </w:p>
     <w:p>
@@ -2159,7 +2263,7 @@
           <w:sz w:val="16"/>
           <w:szCs w:val="16"/>
         </w:rPr>
-        <w:t xml:space="preserve">Mengembalikan OBJEK SEWA GUNA kepada PIHAK PERTAMA dalam kondisi baik sesuai kondisi awal setelah JANGKA WAKTU SEWA GUNA berakhir dengan berita acara.</w:t>
+        <w:t>Mengembalikan OBJEK SEWA GUNA kepada PIHAK PERTAMA dalam kondisi baik sesuai kondisi awal setelah JANGKA WAKTU SEWA GUNA berakhir dengan berita acara.</w:t>
       </w:r>
     </w:p>
     <w:p>
@@ -2192,7 +2296,7 @@
           <w:sz w:val="16"/>
           <w:szCs w:val="16"/>
         </w:rPr>
-        <w:t xml:space="preserve">Melakukan perbaikan/penggantian atas OBJEK SEWA GUNA yang rusak/hilang akibat kesengajaan dan/atau kelalaian sesuai ketentuan peraturan perundang-undangan.</w:t>
+        <w:t>Melakukan perbaikan/penggantian atas OBJEK SEWA GUNA yang rusak/hilang akibat kesengajaan dan/atau kelalaian sesuai ketentuan peraturan perundang-undangan.</w:t>
       </w:r>
     </w:p>
     <w:p>
@@ -2273,18 +2377,16 @@
           <w:szCs w:val="16"/>
           <w:highlight w:val="yellow"/>
         </w:rPr>
-        <w:t xml:space="preserve">{{eventDate}}</w:t>
-      </w:r>
-      <w:r>
-        <w:rPr>
-          <w:rFonts w:ascii="Arial" w:eastAsia="Arial" w:hAnsi="Arial" w:cs="Arial"/>
-          <w:color w:val="000000"/>
-          <w:sz w:val="16"/>
-          <w:szCs w:val="16"/>
-        </w:rPr>
-        <w:t xml:space="preserve">, selanjutnya disebut “JANGKA WAKTU SEWA GUNA” dan dapat </w:t>
-        <w:lastRenderedPageBreak/>
-        <w:t xml:space="preserve">diperpanjang sesuai dengan kesepakatan PARA PIHAK, yang dituangkan dalam bentuk adendum yang merupakan bagian tidak terpisahkan dari PERJANJIAN ini.</w:t>
+        <w:t>{{eventDate}}</w:t>
+      </w:r>
+      <w:r>
+        <w:rPr>
+          <w:rFonts w:ascii="Arial" w:eastAsia="Arial" w:hAnsi="Arial" w:cs="Arial"/>
+          <w:color w:val="000000"/>
+          <w:sz w:val="16"/>
+          <w:szCs w:val="16"/>
+        </w:rPr>
+        <w:t>, selanjutnya disebut “JANGKA WAKTU SEWA GUNA” dan dapat diperpanjang sesuai dengan kesepakatan PARA PIHAK, yang dituangkan dalam bentuk adendum yang merupakan bagian tidak terpisahkan dari PERJANJIAN ini.</w:t>
       </w:r>
     </w:p>
     <w:p>
@@ -2317,7 +2419,7 @@
           <w:sz w:val="16"/>
           <w:szCs w:val="16"/>
         </w:rPr>
-        <w:t xml:space="preserve">Perpanjangan JANGKA WAKTU SEWA GUNA sebagaimana dimaksud pada Pasal 6.1  dilaksanakan berdasarkan persetujuan tertulis dari PIHAK PERTAMA dengan penyampaian Surat Penawaran Harga.</w:t>
+        <w:t>Perpanjangan JANGKA WAKTU SEWA GUNA sebagaimana dimaksud pada Pasal 6.1  dilaksanakan berdasarkan persetujuan tertulis dari PIHAK PERTAMA dengan penyampaian Surat Penawaran Harga.</w:t>
       </w:r>
     </w:p>
     <w:p>
@@ -2398,7 +2500,7 @@
           <w:szCs w:val="16"/>
           <w:highlight w:val="yellow"/>
         </w:rPr>
-        <w:t xml:space="preserve">{{nilaiSewa}}</w:t>
+        <w:t>{{nilaiSewa}}</w:t>
       </w:r>
       <w:r>
         <w:rPr>
@@ -2417,7 +2519,7 @@
           <w:szCs w:val="16"/>
           <w:highlight w:val="yellow"/>
         </w:rPr>
-        <w:t xml:space="preserve">{{paymentDeadline}}.</w:t>
+        <w:t>{{paymentDeadline}}.</w:t>
       </w:r>
     </w:p>
     <w:p>
@@ -2450,7 +2552,8 @@
           <w:sz w:val="16"/>
           <w:szCs w:val="16"/>
         </w:rPr>
-        <w:t xml:space="preserve">Besaran kewajiban pembayaran uang jaminan (</w:t>
+        <w:lastRenderedPageBreak/>
+        <w:t>Besaran kewajiban pembayaran uang jaminan (</w:t>
       </w:r>
       <w:r>
         <w:rPr>
@@ -2469,7 +2572,7 @@
           <w:sz w:val="16"/>
           <w:szCs w:val="16"/>
         </w:rPr>
-        <w:t xml:space="preserve">adalah sebesar Rp0,- (nol_rupiah), yang wajib dibayarkan sekaligus paling lambat 1 (satu) hari sebelum JANGKA WAKTU SEWA GUNA.</w:t>
+        <w:t>adalah sebesar Rp0,- (nol_rupiah), yang wajib dibayarkan sekaligus paling lambat 1 (satu) hari sebelum JANGKA WAKTU SEWA GUNA.</w:t>
       </w:r>
     </w:p>
     <w:p>
@@ -2502,7 +2605,7 @@
           <w:sz w:val="16"/>
           <w:szCs w:val="16"/>
         </w:rPr>
-        <w:t xml:space="preserve">Pengembalian uang jaminan (</w:t>
+        <w:t>Pengembalian uang jaminan (</w:t>
       </w:r>
       <w:r>
         <w:rPr>
@@ -2573,7 +2676,7 @@
           <w:sz w:val="16"/>
           <w:szCs w:val="16"/>
         </w:rPr>
-        <w:t xml:space="preserve">sebagaimana disampaikan dalam tagihan (</w:t>
+        <w:t>sebagaimana disampaikan dalam tagihan (</w:t>
       </w:r>
       <w:r>
         <w:rPr>
@@ -2625,7 +2728,7 @@
           <w:sz w:val="16"/>
           <w:szCs w:val="16"/>
         </w:rPr>
-        <w:t xml:space="preserve">Pembayaran uang jaminan (</w:t>
+        <w:t>Pembayaran uang jaminan (</w:t>
       </w:r>
       <w:r>
         <w:rPr>
@@ -2663,7 +2766,7 @@
           <w:sz w:val="16"/>
           <w:szCs w:val="16"/>
         </w:rPr>
-        <w:t xml:space="preserve">sebagaimana disampaikan dalam tagihan (</w:t>
+        <w:t>sebagaimana disampaikan dalam tagihan (</w:t>
       </w:r>
       <w:r>
         <w:rPr>
@@ -2706,7 +2809,7 @@
           <w:sz w:val="16"/>
           <w:szCs w:val="16"/>
         </w:rPr>
-        <w:t xml:space="preserve">Dalam hal terdapat:</w:t>
+        <w:t>Dalam hal terdapat:</w:t>
       </w:r>
     </w:p>
     <w:p>
@@ -2739,7 +2842,7 @@
           <w:sz w:val="16"/>
           <w:szCs w:val="16"/>
         </w:rPr>
-        <w:t xml:space="preserve">tagihan tunggakan kewajiban;</w:t>
+        <w:t>tagihan tunggakan kewajiban;</w:t>
       </w:r>
     </w:p>
     <w:p>
@@ -2772,7 +2875,7 @@
           <w:sz w:val="16"/>
           <w:szCs w:val="16"/>
         </w:rPr>
-        <w:t xml:space="preserve">kerusakan aset yang diakibatkan karena kelalaian pemeliharaan oleh PIHAK KEDUA; dan/atau</w:t>
+        <w:t>kerusakan aset yang diakibatkan karena kelalaian pemeliharaan oleh PIHAK KEDUA; dan/atau</w:t>
       </w:r>
     </w:p>
     <w:p>
@@ -2805,7 +2908,7 @@
           <w:sz w:val="16"/>
           <w:szCs w:val="16"/>
         </w:rPr>
-        <w:t xml:space="preserve">kerugian yang dialami oleh PIHAK PERTAMA akibat kelalaian atau cidera janji oleh PIHAK KEDUA atas ketentuan-ketentuan sebagaimana diatur dalam PERJANJIAN ini,</w:t>
+        <w:t>kerugian yang dialami oleh PIHAK PERTAMA akibat kelalaian atau cidera janji oleh PIHAK KEDUA atas ketentuan-ketentuan sebagaimana diatur dalam PERJANJIAN ini,</w:t>
       </w:r>
     </w:p>
     <w:p>
@@ -2834,7 +2937,7 @@
           <w:sz w:val="16"/>
           <w:szCs w:val="16"/>
         </w:rPr>
-        <w:t xml:space="preserve">uang jaminan (</w:t>
+        <w:t>uang jaminan (</w:t>
       </w:r>
       <w:r>
         <w:rPr>
@@ -2852,7 +2955,7 @@
           <w:sz w:val="16"/>
           <w:szCs w:val="16"/>
         </w:rPr>
-        <w:t xml:space="preserve">sebagaimana dimaksud dalam Pasal 7.3 dilakukan setelah memperhitungkan seluruh tunggakan/kewajiban/kerugian tersebut.</w:t>
+        <w:t>sebagaimana dimaksud dalam Pasal 7.3 dilakukan setelah memperhitungkan seluruh tunggakan/kewajiban/kerugian tersebut.</w:t>
       </w:r>
     </w:p>
     <w:p>
@@ -2937,7 +3040,7 @@
           <w:sz w:val="16"/>
           <w:szCs w:val="16"/>
         </w:rPr>
-        <w:t xml:space="preserve">Dalam hal dilakukan perpanjangan JANGKA WAKTU SEWA GUNA, besaran uang SEWA GUNA atas OBJEK SEWA GUNA disampaikan berdasarkan Surat Penawaran Harga yang disampaikan oleh PIHAK PERTAMA kepada PIHAK KEDUA.</w:t>
+        <w:t>Dalam hal dilakukan perpanjangan JANGKA WAKTU SEWA GUNA, besaran uang SEWA GUNA atas OBJEK SEWA GUNA disampaikan berdasarkan Surat Penawaran Harga yang disampaikan oleh PIHAK PERTAMA kepada PIHAK KEDUA.</w:t>
       </w:r>
       <w:r>
         <w:rPr>
@@ -3027,7 +3130,7 @@
           <w:sz w:val="16"/>
           <w:szCs w:val="16"/>
         </w:rPr>
-        <w:t xml:space="preserve">PIHAK PERTAMA memberikan sanksi dan/atau denda kepada PIHAK KEDUA dalam hal PIHAK KEDUA:</w:t>
+        <w:t>PIHAK PERTAMA memberikan sanksi dan/atau denda kepada PIHAK KEDUA dalam hal PIHAK KEDUA:</w:t>
       </w:r>
     </w:p>
     <w:p>
@@ -3061,7 +3164,7 @@
           <w:sz w:val="16"/>
           <w:szCs w:val="16"/>
         </w:rPr>
-        <w:t xml:space="preserve">penggunaan OBJEK SEWA</w:t>
+        <w:t>penggunaan OBJEK SEWA</w:t>
       </w:r>
       <w:r>
         <w:rPr>
@@ -3113,7 +3216,7 @@
           <w:sz w:val="16"/>
           <w:szCs w:val="16"/>
         </w:rPr>
-        <w:t xml:space="preserve">dimaksud dalam Pasal 7;</w:t>
+        <w:t>dimaksud dalam Pasal 7;</w:t>
       </w:r>
     </w:p>
     <w:p>
@@ -3138,7 +3241,7 @@
           <w:sz w:val="16"/>
           <w:szCs w:val="16"/>
         </w:rPr>
-        <w:t xml:space="preserve">Tidak melakukan perbaikan/penggantian atas OBJEK SEWA GUNA yang rusak/hilang sebagaimana dimaksud pada ayat 5.5.7; dan/atau</w:t>
+        <w:t>Tidak melakukan perbaikan/penggantian atas OBJEK SEWA GUNA yang rusak/hilang sebagaimana dimaksud pada ayat 5.5.7; dan/atau</w:t>
       </w:r>
     </w:p>
     <w:p>
@@ -3163,7 +3266,7 @@
           <w:sz w:val="16"/>
           <w:szCs w:val="16"/>
         </w:rPr>
-        <w:t xml:space="preserve">Tidak melakukan kewajiban lainnya sebagaimana dimaksud dalam Perjanjian ini.</w:t>
+        <w:t>Tidak melakukan kewajiban lainnya sebagaimana dimaksud dalam Perjanjian ini.</w:t>
       </w:r>
     </w:p>
     <w:p>
@@ -3261,7 +3364,7 @@
           <w:sz w:val="16"/>
           <w:szCs w:val="16"/>
         </w:rPr>
-        <w:t xml:space="preserve">denda sebesar 2% (dua persen) perbulan dengan pembulatan 1 bulan pada keterlambatan harian minimal 1 (satu) hari dengan maksimal 24 (dua puluh empat) bulan, dari nilai besaran uang SEWA GUNA yang harus dibayarkan atau dari sisa besaran kewajiban yang harus dibayarkan sejak tanggal jatuh tempo pembayaran sebagaimana dimaksud Perjanjian ini,</w:t>
+        <w:t>denda sebesar 2% (dua persen) perbulan dengan pembulatan 1 bulan pada keterlambatan harian minimal 1 (satu) hari dengan maksimal 24 (dua puluh empat) bulan, dari nilai besaran uang SEWA GUNA yang harus dibayarkan atau dari sisa besaran kewajiban yang harus dibayarkan sejak tanggal jatuh tempo pembayaran sebagaimana dimaksud Perjanjian ini,</w:t>
       </w:r>
       <w:r>
         <w:rPr>
@@ -3280,7 +3383,7 @@
           <w:sz w:val="16"/>
           <w:szCs w:val="16"/>
         </w:rPr>
-        <w:t xml:space="preserve">untuk pelanggaran sebagaimana dimaksud pada ayat 8.1 huruf b</w:t>
+        <w:t>untuk pelanggaran sebagaimana dimaksud pada ayat 8.1 huruf b</w:t>
       </w:r>
       <w:r>
         <w:rPr>
@@ -3323,7 +3426,7 @@
           <w:sz w:val="16"/>
           <w:szCs w:val="16"/>
         </w:rPr>
-        <w:t xml:space="preserve">sanksi sebagaimana dimaksud dalam ketentuan peraturan perundang-undangan, untuk pelanggaran sebagaimana dimaksud pada ayat 8.1 huruf c dan huruf d.</w:t>
+        <w:t>sanksi sebagaimana dimaksud dalam ketentuan peraturan perundang-undangan, untuk pelanggaran sebagaimana dimaksud pada ayat 8.1 huruf c dan huruf d.</w:t>
       </w:r>
     </w:p>
     <w:p>
@@ -3423,7 +3526,7 @@
           <w:sz w:val="16"/>
           <w:szCs w:val="16"/>
         </w:rPr>
-        <w:t xml:space="preserve">Semua pajak terkait dengan pelaksanaan PERJANJIAN ini menjadi tanggungan masing-masing PIHAK, kecuali ditentukan lain dalam PERJANJIAN ini, sesuai ketentuan peraturan perundang-undangan di bidang perpajakan yang berlaku di Indonesia.</w:t>
+        <w:t>Semua pajak terkait dengan pelaksanaan PERJANJIAN ini menjadi tanggungan masing-masing PIHAK, kecuali ditentukan lain dalam PERJANJIAN ini, sesuai ketentuan peraturan perundang-undangan di bidang perpajakan yang berlaku di Indonesia.</w:t>
       </w:r>
     </w:p>
     <w:p>
@@ -3491,7 +3594,14 @@
           <w:sz w:val="16"/>
           <w:szCs w:val="16"/>
         </w:rPr>
-        <w:t xml:space="preserve">PERJANJIAN ini beserta seluruh hak dan kewajiban PARA PIHAK didalamnya tunduk pada dan ditafsirkan berdasarkan pada hukum Indonesia dan ketentuan peraturan perundangan di wilayah Republik Indonesia.</w:t>
+        <w:t>PERJANJIAN ini beserta seluruh hak dan kewajiban PARA PIHAK didalamnya tunduk pada dan ditafsirkan berdasarkan pada hukum Indonesia dan ketentuan peraturan perundangan di wilayah Republik Indonesia.</w:t>
+      </w:r>
+      <w:r>
+        <w:rPr>
+          <w:rFonts w:ascii="Arial" w:eastAsia="Arial" w:hAnsi="Arial" w:cs="Arial"/>
+          <w:sz w:val="16"/>
+          <w:szCs w:val="16"/>
+        </w:rPr>
         <w:tab/>
       </w:r>
     </w:p>
@@ -3572,7 +3682,7 @@
           <w:sz w:val="16"/>
           <w:szCs w:val="16"/>
         </w:rPr>
-        <w:t xml:space="preserve">Setiap perselisihan yang terjadi antara PARA PIHAK sehubungan dengan pelaksanaan PERJANJIAN ini diselesaikan secara musyawarah untuk mufakat.</w:t>
+        <w:t>Setiap perselisihan yang terjadi antara PARA PIHAK sehubungan dengan pelaksanaan PERJANJIAN ini diselesaikan secara musyawarah untuk mufakat.</w:t>
       </w:r>
     </w:p>
     <w:p>
@@ -3604,7 +3714,7 @@
           <w:sz w:val="16"/>
           <w:szCs w:val="16"/>
         </w:rPr>
-        <w:t xml:space="preserve">Apabila tidak dapat tercapai kata mufakat, maka PARA PIHAK sepakat untuk menyelesaikan melalui Kepaniteraan Pengadilan Negeri Jakarta Pusat.</w:t>
+        <w:t>Apabila tidak dapat tercapai kata mufakat, maka PARA PIHAK sepakat untuk menyelesaikan melalui Kepaniteraan Pengadilan Negeri Jakarta Pusat.</w:t>
       </w:r>
     </w:p>
     <w:p>
@@ -3658,7 +3768,6 @@
           <w:sz w:val="16"/>
           <w:szCs w:val="16"/>
         </w:rPr>
-        <w:lastRenderedPageBreak/>
         <w:t>PASAL 12</w:t>
       </w:r>
     </w:p>
@@ -3716,7 +3825,7 @@
           <w:sz w:val="16"/>
           <w:szCs w:val="16"/>
         </w:rPr>
-        <w:t xml:space="preserve">Setiap surat menyurat atau pemberitahuan-pemberitahuan yang diberikan kepada salah satu PIHAK oleh PIHAK lainnya akan dibuat secara tertulis dan disampaikan secara langsung atau dikirimkan melalui surat dan/atau faksimili atau dengan cara lain yang disetujui oleh PARA PIHAK dengan alamat berikut ini:</w:t>
+        <w:t>Setiap surat menyurat atau pemberitahuan-pemberitahuan yang diberikan kepada salah satu PIHAK oleh PIHAK lainnya akan dibuat secara tertulis dan disampaikan secara langsung atau dikirimkan melalui surat dan/atau faksimili atau dengan cara lain yang disetujui oleh PARA PIHAK dengan alamat berikut ini:</w:t>
       </w:r>
     </w:p>
     <w:p>
@@ -3756,7 +3865,7 @@
           <w:sz w:val="16"/>
           <w:szCs w:val="16"/>
         </w:rPr>
-        <w:t xml:space="preserve">KEMENTERIAN KEUANGAN REPUBLIK INDONESIA</w:t>
+        <w:t>KEMENTERIAN KEUANGAN REPUBLIK INDONESIA</w:t>
       </w:r>
     </w:p>
     <w:p>
@@ -3796,7 +3905,7 @@
           <w:sz w:val="16"/>
           <w:szCs w:val="16"/>
         </w:rPr>
-        <w:t xml:space="preserve">c.q. Direktur Pengembangan dan Pendayagunaan</w:t>
+        <w:t>c.q. Direktur Pengembangan dan Pendayagunaan</w:t>
       </w:r>
     </w:p>
     <w:p>
@@ -3816,7 +3925,7 @@
           <w:sz w:val="16"/>
           <w:szCs w:val="16"/>
         </w:rPr>
-        <w:t xml:space="preserve">Gedung Dhanadyaksa Hutama Nomor 62A, Jalan Diponegoro, Jalan Pegangsaan, Jakarta Pusat</w:t>
+        <w:t>Gedung Dhanadyaksa Hutama Nomor 62A, Jalan Diponegoro, Jalan Pegangsaan, Jakarta Pusat</w:t>
       </w:r>
     </w:p>
     <w:p>
@@ -3836,6 +3945,7 @@
           <w:sz w:val="16"/>
           <w:szCs w:val="16"/>
         </w:rPr>
+        <w:lastRenderedPageBreak/>
         <w:t>Telepon: (021) 21392822</w:t>
       </w:r>
     </w:p>
@@ -3898,7 +4008,7 @@
           <w:szCs w:val="16"/>
           <w:highlight w:val="yellow"/>
         </w:rPr>
-        <w:t xml:space="preserve">{{signatoryTitle}},</w:t>
+        <w:t>{{signatoryTitle}},</w:t>
       </w:r>
     </w:p>
     <w:p>
@@ -3920,7 +4030,7 @@
           <w:szCs w:val="16"/>
           <w:highlight w:val="yellow"/>
         </w:rPr>
-        <w:t xml:space="preserve">{{institutionName}}</w:t>
+        <w:t>{{institutionName}}</w:t>
       </w:r>
     </w:p>
     <w:p>
@@ -3942,7 +4052,7 @@
           <w:szCs w:val="16"/>
           <w:highlight w:val="yellow"/>
         </w:rPr>
-        <w:t xml:space="preserve">{{institutionAddress}}</w:t>
+        <w:t>{{institutionAddress}}</w:t>
       </w:r>
     </w:p>
     <w:p>
@@ -3963,7 +4073,7 @@
           <w:szCs w:val="16"/>
           <w:highlight w:val="yellow"/>
         </w:rPr>
-        <w:t xml:space="preserve">Telp. (021) 29600000</w:t>
+        <w:t>Telp. (021) 29600000</w:t>
       </w:r>
     </w:p>
     <w:p>
@@ -3996,7 +4106,7 @@
           <w:sz w:val="16"/>
           <w:szCs w:val="16"/>
         </w:rPr>
-        <w:t xml:space="preserve">Setiap PIHAK dapat mengubah alamatnya dengan memberikan pemberitahuan kepada PIHAK lain secara tertulis tanpa perlu membuat adendum PERJANJIAN.</w:t>
+        <w:t>Setiap PIHAK dapat mengubah alamatnya dengan memberikan pemberitahuan kepada PIHAK lain secara tertulis tanpa perlu membuat adendum PERJANJIAN.</w:t>
       </w:r>
     </w:p>
     <w:p>
@@ -4029,7 +4139,7 @@
           <w:sz w:val="16"/>
           <w:szCs w:val="16"/>
         </w:rPr>
-        <w:t xml:space="preserve">Setiap pemberitahuan, permintaan atau komunikasi yang dialamatkan kepada salah satu PIHAK dianggap telah diterima:</w:t>
+        <w:t>Setiap pemberitahuan, permintaan atau komunikasi yang dialamatkan kepada salah satu PIHAK dianggap telah diterima:</w:t>
       </w:r>
     </w:p>
     <w:p>
@@ -4062,7 +4172,7 @@
           <w:sz w:val="16"/>
           <w:szCs w:val="16"/>
         </w:rPr>
-        <w:t xml:space="preserve">apabila melalui komunikasi elektronik (</w:t>
+        <w:t>apabila melalui komunikasi elektronik (</w:t>
       </w:r>
       <w:r>
         <w:rPr>
@@ -4147,7 +4257,7 @@
           <w:sz w:val="16"/>
           <w:szCs w:val="16"/>
         </w:rPr>
-        <w:t xml:space="preserve">apabila dengan faksimili, dianggap telah diterima dengan bukti konfirmasi atas transmisi,</w:t>
+        <w:t>apabila dengan faksimili, dianggap telah diterima dengan bukti konfirmasi atas transmisi,</w:t>
       </w:r>
     </w:p>
     <w:p>
@@ -4170,7 +4280,7 @@
           <w:sz w:val="16"/>
           <w:szCs w:val="16"/>
         </w:rPr>
-        <w:t xml:space="preserve">dengan ketentuan apabila tanggal penerimaan surat dan/atau faksimili bukan merupakan hari kerja, maka suraatau faksimili tersebut dianggap telah diserahkan atau diterima pada hari kerja berikutnya.</w:t>
+        <w:t>dengan ketentuan apabila tanggal penerimaan surat dan/atau faksimili bukan merupakan hari kerja, maka suraatau faksimili tersebut dianggap telah diserahkan atau diterima pada hari kerja berikutnya.</w:t>
       </w:r>
     </w:p>
     <w:p>
@@ -4241,7 +4351,7 @@
           <w:sz w:val="16"/>
           <w:szCs w:val="16"/>
         </w:rPr>
-        <w:t xml:space="preserve">PARA PIHAK tidak bertanggung jawab atas kegagalan dalam memenuhi PERJANJIAN ini, baik langsung maupun tidak langsung dikarenakan oleh keadaan di luar kendali dan kemampuannya, yang meliputi tetapi tidak terbatas pada perubahan peraturan yang diterbitkan oleh Pemerintah, bencana alam, banjir, pemogokan umum, perang, pemberontakan, revolusi, makar, huru-hara, terorisme, atau wabah/epidemik, yang selanjutnya disebut sebagai “</w:t>
+        <w:t>PARA PIHAK tidak bertanggung jawab atas kegagalan dalam memenuhi PERJANJIAN ini, baik langsung maupun tidak langsung dikarenakan oleh keadaan di luar kendali dan kemampuannya, yang meliputi tetapi tidak terbatas pada perubahan peraturan yang diterbitkan oleh Pemerintah, bencana alam, banjir, pemogokan umum, perang, pemberontakan, revolusi, makar, huru-hara, terorisme, atau wabah/epidemik, yang selanjutnya disebut sebagai “</w:t>
       </w:r>
       <w:r>
         <w:rPr>
@@ -4293,7 +4403,7 @@
           <w:sz w:val="16"/>
           <w:szCs w:val="16"/>
         </w:rPr>
-        <w:t xml:space="preserve">Jika PIHAK PERTAMA atau PIHAK KEDUA tidak dapat melaksanakan PERJANJIAN ini karena mengalami atau dipengaruhi oleh KEADAAN KAHAR, maka PIHAK yang mengalami KEADAAN KAHAR harus memberitahukan secara tertulis kepada PIHAK lainnya dalam waktu paling lambat 14 (empat belas) hari kalender setelah terjadinya KEADAAN KAHAR dengan melampirkan bukti-bukti dan surat keterangan resmi dari pejabat/instansi yang berwenang dengan disertai perkiraan atau upaya-upaya yang akan atau telah dilakukan dalam rangka mengatasi KEADAAN KAHAR tersebut.</w:t>
+        <w:t>Jika PIHAK PERTAMA atau PIHAK KEDUA tidak dapat melaksanakan PERJANJIAN ini karena mengalami atau dipengaruhi oleh KEADAAN KAHAR, maka PIHAK yang mengalami KEADAAN KAHAR harus memberitahukan secara tertulis kepada PIHAK lainnya dalam waktu paling lambat 14 (empat belas) hari kalender setelah terjadinya KEADAAN KAHAR dengan melampirkan bukti-bukti dan surat keterangan resmi dari pejabat/instansi yang berwenang dengan disertai perkiraan atau upaya-upaya yang akan atau telah dilakukan dalam rangka mengatasi KEADAAN KAHAR tersebut.</w:t>
       </w:r>
     </w:p>
     <w:p>
@@ -4326,7 +4436,7 @@
           <w:sz w:val="16"/>
           <w:szCs w:val="16"/>
         </w:rPr>
-        <w:t xml:space="preserve">Jika PIHAK yang mengalami KEADAAN KAHAR tidak dapat melaksanakan seluruh atau sebagian ketentuan dalam PERJANJIAN ini karena mengalami atau dipengaruhi oleh KEADAAN KAHAR lebih dari 30 (tiga puluh) hari kalender, maka PIHAK tersebut dapat mengusulkan perubahan ketentuan PERJANJIAN ini kepada PIHAK lainnya dengan pemberitahuan tertulis.</w:t>
+        <w:t>Jika PIHAK yang mengalami KEADAAN KAHAR tidak dapat melaksanakan seluruh atau sebagian ketentuan dalam PERJANJIAN ini karena mengalami atau dipengaruhi oleh KEADAAN KAHAR lebih dari 30 (tiga puluh) hari kalender, maka PIHAK tersebut dapat mengusulkan perubahan ketentuan PERJANJIAN ini kepada PIHAK lainnya dengan pemberitahuan tertulis.</w:t>
       </w:r>
     </w:p>
     <w:p>
@@ -4359,7 +4469,7 @@
           <w:sz w:val="16"/>
           <w:szCs w:val="16"/>
         </w:rPr>
-        <w:t xml:space="preserve">Hal-hal merugikan yang disebabkan oleh perbuatan kelalaian PIHAK PERTAMA atau PIHAK KEDUA tidak dapat digolongkan KEADAAN KAHAR.</w:t>
+        <w:t>Hal-hal merugikan yang disebabkan oleh perbuatan kelalaian PIHAK PERTAMA atau PIHAK KEDUA tidak dapat digolongkan KEADAAN KAHAR.</w:t>
       </w:r>
     </w:p>
     <w:p>
@@ -4392,7 +4502,7 @@
           <w:sz w:val="16"/>
           <w:szCs w:val="16"/>
         </w:rPr>
-        <w:t xml:space="preserve">Tindakan yang diambil untuk melaksanakan ketentuan PERJANJIAN akibat terjadinya KEADAAN KAHAR diserahkan kepada kesepakatan dari PARA PIHAK.</w:t>
+        <w:t>Tindakan yang diambil untuk melaksanakan ketentuan PERJANJIAN akibat terjadinya KEADAAN KAHAR diserahkan kepada kesepakatan dari PARA PIHAK.</w:t>
       </w:r>
     </w:p>
     <w:p>
@@ -4425,7 +4535,7 @@
           <w:sz w:val="16"/>
           <w:szCs w:val="16"/>
         </w:rPr>
-        <w:t xml:space="preserve">Kerugian yang diderita dan biaya yang dikeluarkan oleh PIHAK KEDUA akibat terjadinya KEADAAN KAHAR bukan menjadi tanggung jawab PIHAK PERTAMA, demikian pula sebaliknya berlaku pada PIHAK KEDUA.</w:t>
+        <w:t>Kerugian yang diderita dan biaya yang dikeluarkan oleh PIHAK KEDUA akibat terjadinya KEADAAN KAHAR bukan menjadi tanggung jawab PIHAK PERTAMA, demikian pula sebaliknya berlaku pada PIHAK KEDUA.</w:t>
       </w:r>
     </w:p>
     <w:p>
@@ -4496,7 +4606,7 @@
           <w:sz w:val="16"/>
           <w:szCs w:val="16"/>
         </w:rPr>
-        <w:t xml:space="preserve">Tanpa mengesampingkan hal-hal lain dalam PERJANJIAN ini yang dapat bertentangan, PERJANJIAN ini dapat berakhir apabila terjadi salah satu dari keadaan-keadaan berikut:</w:t>
+        <w:t>Tanpa mengesampingkan hal-hal lain dalam PERJANJIAN ini yang dapat bertentangan, PERJANJIAN ini dapat berakhir apabila terjadi salah satu dari keadaan-keadaan berikut:</w:t>
       </w:r>
     </w:p>
     <w:p>
@@ -4595,7 +4705,7 @@
           <w:sz w:val="16"/>
           <w:szCs w:val="16"/>
         </w:rPr>
-        <w:t xml:space="preserve">pengakhiran perjanjian SEWA GUNA secara sepihak oleh PIHAK PERTAMA dalam hal PIHAK KEDUA tidak memenuhi kewajiban sebagaimana tertuang dalam perjanjian SEWA GUNA; atau</w:t>
+        <w:t>pengakhiran perjanjian SEWA GUNA secara sepihak oleh PIHAK PERTAMA dalam hal PIHAK KEDUA tidak memenuhi kewajiban sebagaimana tertuang dalam perjanjian SEWA GUNA; atau</w:t>
       </w:r>
     </w:p>
     <w:p>
@@ -4628,7 +4738,7 @@
           <w:sz w:val="16"/>
           <w:szCs w:val="16"/>
         </w:rPr>
-        <w:t xml:space="preserve">ketentuan lain sesuai peraturan perundang-undangan.</w:t>
+        <w:t>ketentuan lain sesuai peraturan perundang-undangan.</w:t>
       </w:r>
     </w:p>
     <w:p>
@@ -4661,7 +4771,7 @@
           <w:sz w:val="16"/>
           <w:szCs w:val="16"/>
         </w:rPr>
-        <w:t xml:space="preserve">PARA PIHAK dengan ini secara tegas mengesampingkan ketentuan dalam Pasal 1266 Kitab Undang-Undang Hukum Perdata mengenai persyaratan dimintakannya suatu putusan pengadilan untuk mengakhiri PERJANJIAN ini.</w:t>
+        <w:t>PARA PIHAK dengan ini secara tegas mengesampingkan ketentuan dalam Pasal 1266 Kitab Undang-Undang Hukum Perdata mengenai persyaratan dimintakannya suatu putusan pengadilan untuk mengakhiri PERJANJIAN ini.</w:t>
       </w:r>
     </w:p>
     <w:p>
@@ -4694,7 +4804,7 @@
           <w:sz w:val="16"/>
           <w:szCs w:val="16"/>
         </w:rPr>
-        <w:t xml:space="preserve">Atas berakhirnya PERJANJIAN ini, tidak menghilangkan hak dan kewajiban PARA PIHAK yang timbul dan belum diselesaikan sampai PERJANJIAN ini berakhir.</w:t>
+        <w:t>Atas berakhirnya PERJANJIAN ini, tidak menghilangkan hak dan kewajiban PARA PIHAK yang timbul dan belum diselesaikan sampai PERJANJIAN ini berakhir.</w:t>
       </w:r>
     </w:p>
     <w:p>
@@ -4751,7 +4861,7 @@
           <w:sz w:val="16"/>
           <w:szCs w:val="16"/>
         </w:rPr>
-        <w:t xml:space="preserve">Segala perubahan yang dilakukan serta hal-hal yang belum diatur dalam PERJANJIAN ini akan ditetapkan kemudian secara musyawarah mufakat oleh PARA PIHAK dan akan dituangkan dalam suatu adendum yang merupakan satu kesatuan dan menjadi bagian yang tidak terpisahkan dari PERJANJIAN ini.</w:t>
+        <w:t>Segala perubahan yang dilakukan serta hal-hal yang belum diatur dalam PERJANJIAN ini akan ditetapkan kemudian secara musyawarah mufakat oleh PARA PIHAK dan akan dituangkan dalam suatu adendum yang merupakan satu kesatuan dan menjadi bagian yang tidak terpisahkan dari PERJANJIAN ini.</w:t>
       </w:r>
     </w:p>
     <w:p>
@@ -4792,7 +4902,6 @@
           <w:sz w:val="16"/>
           <w:szCs w:val="16"/>
         </w:rPr>
-        <w:lastRenderedPageBreak/>
         <w:t>PASAL16</w:t>
       </w:r>
     </w:p>
@@ -4831,7 +4940,7 @@
           <w:sz w:val="16"/>
           <w:szCs w:val="16"/>
         </w:rPr>
-        <w:t xml:space="preserve">Dalam hal ketentuan yang terdapat dalam PERJANJIAN ini dinyatakan sebagai tidak sah atau tidak dapat diberlakukan secara hukum, maka ketidaksahan atau ketidakberlakuan tersebut hanya berkaitan pada ketentuan itu atau sebagian daripadanya saja. Sedangkan ketentuan lainnya dari PERJANJIAN ini tetap berlaku dan mempunyai kekuatan hukum secara penuh, kecuali jika terbukti ketentuan Pasal 1320 KUH Perdata tidak terpenuhi.</w:t>
+        <w:t>Dalam hal ketentuan yang terdapat dalam PERJANJIAN ini dinyatakan sebagai tidak sah atau tidak dapat diberlakukan secara hukum, maka ketidaksahan atau ketidakberlakuan tersebut hanya berkaitan pada ketentuan itu atau sebagian daripadanya saja. Sedangkan ketentuan lainnya dari PERJANJIAN ini tetap berlaku dan mempunyai kekuatan hukum secara penuh, kecuali jika terbukti ketentuan Pasal 1320 KUH Perdata tidak terpenuhi.</w:t>
       </w:r>
     </w:p>
     <w:p>
@@ -4901,7 +5010,7 @@
           <w:sz w:val="16"/>
           <w:szCs w:val="16"/>
         </w:rPr>
-        <w:t xml:space="preserve">Segala ketentuan dan persyaratan dalam PERJANJIAN ini berlaku serta mengikat bagi PARA PIHAK.</w:t>
+        <w:t>Segala ketentuan dan persyaratan dalam PERJANJIAN ini berlaku serta mengikat bagi PARA PIHAK.</w:t>
       </w:r>
     </w:p>
     <w:p>
@@ -4933,7 +5042,17 @@
           <w:sz w:val="16"/>
           <w:szCs w:val="16"/>
         </w:rPr>
-        <w:t xml:space="preserve">Apabila terdapat ketentuan dalam PERJANJIAN ini atau dokumen yang dibuat sehubungan dengan PERJANJIAN ini menjadi tidak sah atau tidak dapat dilaksanakan, maka hal tersebut tidak mempengaruhi keabsahan, legalitas dan pelaksanaan ketentuan lain dalam PERJANJIAN ini.</w:t>
+        <w:t xml:space="preserve">Apabila terdapat ketentuan dalam PERJANJIAN ini atau dokumen yang dibuat sehubungan dengan </w:t>
+      </w:r>
+      <w:r>
+        <w:rPr>
+          <w:rFonts w:ascii="Arial" w:eastAsia="Arial" w:hAnsi="Arial" w:cs="Arial"/>
+          <w:color w:val="000000"/>
+          <w:sz w:val="16"/>
+          <w:szCs w:val="16"/>
+        </w:rPr>
+        <w:lastRenderedPageBreak/>
+        <w:t>PERJANJIAN ini menjadi tidak sah atau tidak dapat dilaksanakan, maka hal tersebut tidak mempengaruhi keabsahan, legalitas dan pelaksanaan ketentuan lain dalam PERJANJIAN ini.</w:t>
       </w:r>
     </w:p>
     <w:p>
@@ -4965,7 +5084,7 @@
           <w:sz w:val="16"/>
           <w:szCs w:val="16"/>
         </w:rPr>
-        <w:t xml:space="preserve">Semua Lampiran PERJANJIAN ini merupakan satu kesatuan dan menjadi bagian yang tidak terpisahkan dari PERJANJIAN ini.</w:t>
+        <w:t>Semua Lampiran PERJANJIAN ini merupakan satu kesatuan dan menjadi bagian yang tidak terpisahkan dari PERJANJIAN ini.</w:t>
       </w:r>
     </w:p>
     <w:p>
@@ -4997,7 +5116,7 @@
           <w:sz w:val="16"/>
           <w:szCs w:val="16"/>
         </w:rPr>
-        <w:t xml:space="preserve">PERJANJIAN ini dibuat rangkap 2 (dua) dalam Bahasa Indonesia dan mempunyai kekuatan hukum yang sama, rangkap pertama dan rangkap kedua masing-masing bermeterai cukup, rangkap pertama untuk PIHAK PERTAMA sedangkan rangkap kedua untuk PIHAK KEDUA.</w:t>
+        <w:t>PERJANJIAN ini dibuat rangkap 2 (dua) dalam Bahasa Indonesia dan mempunyai kekuatan hukum yang sama, rangkap pertama dan rangkap kedua masing-masing bermeterai cukup, rangkap pertama untuk PIHAK PERTAMA sedangkan rangkap kedua untuk PIHAK KEDUA.</w:t>
       </w:r>
     </w:p>
     <w:p>
@@ -5016,7 +5135,7 @@
           <w:sz w:val="16"/>
           <w:szCs w:val="16"/>
         </w:rPr>
-        <w:t xml:space="preserve">Demikian PERJANJIAN ini dibuat dan ditandatangani oleh PARA PIHAK pada hari, tanggal, bulan dan tahun sebagaimana tersebut di atas untuk dipergunakan sebagaimana mestinya.</w:t>
+        <w:t>Demikian PERJANJIAN ini dibuat dan ditandatangani oleh PARA PIHAK pada hari, tanggal, bulan dan tahun sebagaimana tersebut di atas untuk dipergunakan sebagaimana mestinya.</w:t>
       </w:r>
     </w:p>
     <w:p>
@@ -5044,7 +5163,7 @@
           <w:szCs w:val="16"/>
           <w:highlight w:val="yellow"/>
         </w:rPr>
-        <w:t xml:space="preserve">{{offerLetterNoDate}}</w:t>
+        <w:t>{{offerLetterNoDate}}</w:t>
       </w:r>
       <w:r>
         <w:rPr>
@@ -5056,7 +5175,7 @@
       </w:r>
     </w:p>
     <w:sectPr>
-      <w:headerReference w:type="default" r:id="rId8"/>
+      <w:headerReference w:type="default" r:id="rId11"/>
       <w:pgSz w:w="12240" w:h="18763"/>
       <w:pgMar w:top="562" w:right="1181" w:bottom="2923" w:left="1440" w:header="706" w:footer="706" w:gutter="0"/>
       <w:pgNumType w:start="57"/>
@@ -5070,7 +5189,7 @@
 </file>
 
 <file path=word/endnotes.xml><?xml version="1.0" encoding="utf-8"?>
-<w:endnotes xmlns:wpc="http://schemas.microsoft.com/office/word/2010/wordprocessingCanvas" xmlns:cx="http://schemas.microsoft.com/office/drawing/2014/chartex" xmlns:cx1="http://schemas.microsoft.com/office/drawing/2015/9/8/chartex" xmlns:cx2="http://schemas.microsoft.com/office/drawing/2015/10/21/chartex" xmlns:cx3="http://schemas.microsoft.com/office/drawing/2016/5/9/chartex" xmlns:cx4="http://schemas.microsoft.com/office/drawing/2016/5/10/chartex" xmlns:cx5="http://schemas.microsoft.com/office/drawing/2016/5/11/chartex" xmlns:cx6="http://schemas.microsoft.com/office/drawing/2016/5/12/chartex" xmlns:cx7="http://schemas.microsoft.com/office/drawing/2016/5/13/chartex" xmlns:cx8="http://schemas.microsoft.com/office/drawing/2016/5/14/chartex" xmlns:mc="http://schemas.openxmlformats.org/markup-compatibility/2006" xmlns:aink="http://schemas.microsoft.com/office/drawing/2016/ink" xmlns:am3d="http://schemas.microsoft.com/office/drawing/2017/model3d" xmlns:o="urn:schemas-microsoft-com:office:office" xmlns:oel="http://schemas.microsoft.com/office/2019/extlst" xmlns:r="http://schemas.openxmlformats.org/officeDocument/2006/relationships" xmlns:m="http://schemas.openxmlformats.org/officeDocument/2006/math" xmlns:v="urn:schemas-microsoft-com:vml" xmlns:wp14="http://schemas.microsoft.com/office/word/2010/wordprocessingDrawing" xmlns:wp="http://schemas.openxmlformats.org/drawingml/2006/wordprocessingDrawing" xmlns:w10="urn:schemas-microsoft-com:office:word" xmlns:w="http://schemas.openxmlformats.org/wordprocessingml/2006/main" xmlns:w14="http://schemas.microsoft.com/office/word/2010/wordml" xmlns:w15="http://schemas.microsoft.com/office/word/2012/wordml" xmlns:w16cex="http://schemas.microsoft.com/office/word/2018/wordml/cex" xmlns:w16cid="http://schemas.microsoft.com/office/word/2016/wordml/cid" xmlns:w16="http://schemas.microsoft.com/office/word/2018/wordml" xmlns:w16du="http://schemas.microsoft.com/office/word/2023/wordml/word16du" xmlns:w16sdtdh="http://schemas.microsoft.com/office/word/2020/wordml/sdtdatahash" xmlns:w16sdtfl="http://schemas.microsoft.com/office/word/2024/wordml/sdtformatlock" xmlns:w16se="http://schemas.microsoft.com/office/word/2015/wordml/symex" xmlns:wpg="http://schemas.microsoft.com/office/word/2010/wordprocessingGroup" xmlns:wpi="http://schemas.microsoft.com/office/word/2010/wordprocessingInk" xmlns:wne="http://schemas.microsoft.com/office/word/2006/wordml" xmlns:wps="http://schemas.microsoft.com/office/word/2010/wordprocessingShape" mc:Ignorable="w14 w15 w16se w16cid w16 w16cex w16sdtdh w16sdtfl w16du wp14">
+<w:endnotes xmlns:wpc="http://schemas.microsoft.com/office/word/2010/wordprocessingCanvas" xmlns:cx="http://schemas.microsoft.com/office/drawing/2014/chartex" xmlns:cx1="http://schemas.microsoft.com/office/drawing/2015/9/8/chartex" xmlns:cx2="http://schemas.microsoft.com/office/drawing/2015/10/21/chartex" xmlns:cx3="http://schemas.microsoft.com/office/drawing/2016/5/9/chartex" xmlns:cx4="http://schemas.microsoft.com/office/drawing/2016/5/10/chartex" xmlns:cx5="http://schemas.microsoft.com/office/drawing/2016/5/11/chartex" xmlns:cx6="http://schemas.microsoft.com/office/drawing/2016/5/12/chartex" xmlns:cx7="http://schemas.microsoft.com/office/drawing/2016/5/13/chartex" xmlns:cx8="http://schemas.microsoft.com/office/drawing/2016/5/14/chartex" xmlns:mc="http://schemas.openxmlformats.org/markup-compatibility/2006" xmlns:aink="http://schemas.microsoft.com/office/drawing/2016/ink" xmlns:am3d="http://schemas.microsoft.com/office/drawing/2017/model3d" xmlns:o="urn:schemas-microsoft-com:office:office" xmlns:r="http://schemas.openxmlformats.org/officeDocument/2006/relationships" xmlns:m="http://schemas.openxmlformats.org/officeDocument/2006/math" xmlns:v="urn:schemas-microsoft-com:vml" xmlns:wp14="http://schemas.microsoft.com/office/word/2010/wordprocessingDrawing" xmlns:wp="http://schemas.openxmlformats.org/drawingml/2006/wordprocessingDrawing" xmlns:w10="urn:schemas-microsoft-com:office:word" xmlns:w="http://schemas.openxmlformats.org/wordprocessingml/2006/main" xmlns:w14="http://schemas.microsoft.com/office/word/2010/wordml" xmlns:w15="http://schemas.microsoft.com/office/word/2012/wordml" xmlns:w16cex="http://schemas.microsoft.com/office/word/2018/wordml/cex" xmlns:w16cid="http://schemas.microsoft.com/office/word/2016/wordml/cid" xmlns:w16="http://schemas.microsoft.com/office/word/2018/wordml" xmlns:w16sdtdh="http://schemas.microsoft.com/office/word/2020/wordml/sdtdatahash" xmlns:w16se="http://schemas.microsoft.com/office/word/2015/wordml/symex" xmlns:wpg="http://schemas.microsoft.com/office/word/2010/wordprocessingGroup" xmlns:wpi="http://schemas.microsoft.com/office/word/2010/wordprocessingInk" xmlns:wne="http://schemas.microsoft.com/office/word/2006/wordml" xmlns:wps="http://schemas.microsoft.com/office/word/2010/wordprocessingShape" mc:Ignorable="w14 w15 w16se w16cid w16 w16cex w16sdtdh wp14">
   <w:endnote w:type="separator" w:id="-1">
     <w:p>
       <w:pPr>
@@ -5095,7 +5214,7 @@
 </file>
 
 <file path=word/footnotes.xml><?xml version="1.0" encoding="utf-8"?>
-<w:footnotes xmlns:wpc="http://schemas.microsoft.com/office/word/2010/wordprocessingCanvas" xmlns:cx="http://schemas.microsoft.com/office/drawing/2014/chartex" xmlns:cx1="http://schemas.microsoft.com/office/drawing/2015/9/8/chartex" xmlns:cx2="http://schemas.microsoft.com/office/drawing/2015/10/21/chartex" xmlns:cx3="http://schemas.microsoft.com/office/drawing/2016/5/9/chartex" xmlns:cx4="http://schemas.microsoft.com/office/drawing/2016/5/10/chartex" xmlns:cx5="http://schemas.microsoft.com/office/drawing/2016/5/11/chartex" xmlns:cx6="http://schemas.microsoft.com/office/drawing/2016/5/12/chartex" xmlns:cx7="http://schemas.microsoft.com/office/drawing/2016/5/13/chartex" xmlns:cx8="http://schemas.microsoft.com/office/drawing/2016/5/14/chartex" xmlns:mc="http://schemas.openxmlformats.org/markup-compatibility/2006" xmlns:aink="http://schemas.microsoft.com/office/drawing/2016/ink" xmlns:am3d="http://schemas.microsoft.com/office/drawing/2017/model3d" xmlns:o="urn:schemas-microsoft-com:office:office" xmlns:oel="http://schemas.microsoft.com/office/2019/extlst" xmlns:r="http://schemas.openxmlformats.org/officeDocument/2006/relationships" xmlns:m="http://schemas.openxmlformats.org/officeDocument/2006/math" xmlns:v="urn:schemas-microsoft-com:vml" xmlns:wp14="http://schemas.microsoft.com/office/word/2010/wordprocessingDrawing" xmlns:wp="http://schemas.openxmlformats.org/drawingml/2006/wordprocessingDrawing" xmlns:w10="urn:schemas-microsoft-com:office:word" xmlns:w="http://schemas.openxmlformats.org/wordprocessingml/2006/main" xmlns:w14="http://schemas.microsoft.com/office/word/2010/wordml" xmlns:w15="http://schemas.microsoft.com/office/word/2012/wordml" xmlns:w16cex="http://schemas.microsoft.com/office/word/2018/wordml/cex" xmlns:w16cid="http://schemas.microsoft.com/office/word/2016/wordml/cid" xmlns:w16="http://schemas.microsoft.com/office/word/2018/wordml" xmlns:w16du="http://schemas.microsoft.com/office/word/2023/wordml/word16du" xmlns:w16sdtdh="http://schemas.microsoft.com/office/word/2020/wordml/sdtdatahash" xmlns:w16sdtfl="http://schemas.microsoft.com/office/word/2024/wordml/sdtformatlock" xmlns:w16se="http://schemas.microsoft.com/office/word/2015/wordml/symex" xmlns:wpg="http://schemas.microsoft.com/office/word/2010/wordprocessingGroup" xmlns:wpi="http://schemas.microsoft.com/office/word/2010/wordprocessingInk" xmlns:wne="http://schemas.microsoft.com/office/word/2006/wordml" xmlns:wps="http://schemas.microsoft.com/office/word/2010/wordprocessingShape" mc:Ignorable="w14 w15 w16se w16cid w16 w16cex w16sdtdh w16sdtfl w16du wp14">
+<w:footnotes xmlns:wpc="http://schemas.microsoft.com/office/word/2010/wordprocessingCanvas" xmlns:cx="http://schemas.microsoft.com/office/drawing/2014/chartex" xmlns:cx1="http://schemas.microsoft.com/office/drawing/2015/9/8/chartex" xmlns:cx2="http://schemas.microsoft.com/office/drawing/2015/10/21/chartex" xmlns:cx3="http://schemas.microsoft.com/office/drawing/2016/5/9/chartex" xmlns:cx4="http://schemas.microsoft.com/office/drawing/2016/5/10/chartex" xmlns:cx5="http://schemas.microsoft.com/office/drawing/2016/5/11/chartex" xmlns:cx6="http://schemas.microsoft.com/office/drawing/2016/5/12/chartex" xmlns:cx7="http://schemas.microsoft.com/office/drawing/2016/5/13/chartex" xmlns:cx8="http://schemas.microsoft.com/office/drawing/2016/5/14/chartex" xmlns:mc="http://schemas.openxmlformats.org/markup-compatibility/2006" xmlns:aink="http://schemas.microsoft.com/office/drawing/2016/ink" xmlns:am3d="http://schemas.microsoft.com/office/drawing/2017/model3d" xmlns:o="urn:schemas-microsoft-com:office:office" xmlns:r="http://schemas.openxmlformats.org/officeDocument/2006/relationships" xmlns:m="http://schemas.openxmlformats.org/officeDocument/2006/math" xmlns:v="urn:schemas-microsoft-com:vml" xmlns:wp14="http://schemas.microsoft.com/office/word/2010/wordprocessingDrawing" xmlns:wp="http://schemas.openxmlformats.org/drawingml/2006/wordprocessingDrawing" xmlns:w10="urn:schemas-microsoft-com:office:word" xmlns:w="http://schemas.openxmlformats.org/wordprocessingml/2006/main" xmlns:w14="http://schemas.microsoft.com/office/word/2010/wordml" xmlns:w15="http://schemas.microsoft.com/office/word/2012/wordml" xmlns:w16cex="http://schemas.microsoft.com/office/word/2018/wordml/cex" xmlns:w16cid="http://schemas.microsoft.com/office/word/2016/wordml/cid" xmlns:w16="http://schemas.microsoft.com/office/word/2018/wordml" xmlns:w16sdtdh="http://schemas.microsoft.com/office/word/2020/wordml/sdtdatahash" xmlns:w16se="http://schemas.microsoft.com/office/word/2015/wordml/symex" xmlns:wpg="http://schemas.microsoft.com/office/word/2010/wordprocessingGroup" xmlns:wpi="http://schemas.microsoft.com/office/word/2010/wordprocessingInk" xmlns:wne="http://schemas.microsoft.com/office/word/2006/wordml" xmlns:wps="http://schemas.microsoft.com/office/word/2010/wordprocessingShape" mc:Ignorable="w14 w15 w16se w16cid w16 w16cex w16sdtdh wp14">
   <w:footnote w:type="separator" w:id="-1">
     <w:p>
       <w:pPr>
@@ -5120,7 +5239,7 @@
 </file>
 
 <file path=word/header1.xml><?xml version="1.0" encoding="utf-8"?>
-<w:hdr xmlns:wpc="http://schemas.microsoft.com/office/word/2010/wordprocessingCanvas" xmlns:cx="http://schemas.microsoft.com/office/drawing/2014/chartex" xmlns:cx1="http://schemas.microsoft.com/office/drawing/2015/9/8/chartex" xmlns:cx2="http://schemas.microsoft.com/office/drawing/2015/10/21/chartex" xmlns:cx3="http://schemas.microsoft.com/office/drawing/2016/5/9/chartex" xmlns:cx4="http://schemas.microsoft.com/office/drawing/2016/5/10/chartex" xmlns:cx5="http://schemas.microsoft.com/office/drawing/2016/5/11/chartex" xmlns:cx6="http://schemas.microsoft.com/office/drawing/2016/5/12/chartex" xmlns:cx7="http://schemas.microsoft.com/office/drawing/2016/5/13/chartex" xmlns:cx8="http://schemas.microsoft.com/office/drawing/2016/5/14/chartex" xmlns:mc="http://schemas.openxmlformats.org/markup-compatibility/2006" xmlns:aink="http://schemas.microsoft.com/office/drawing/2016/ink" xmlns:am3d="http://schemas.microsoft.com/office/drawing/2017/model3d" xmlns:o="urn:schemas-microsoft-com:office:office" xmlns:oel="http://schemas.microsoft.com/office/2019/extlst" xmlns:r="http://schemas.openxmlformats.org/officeDocument/2006/relationships" xmlns:m="http://schemas.openxmlformats.org/officeDocument/2006/math" xmlns:v="urn:schemas-microsoft-com:vml" xmlns:wp14="http://schemas.microsoft.com/office/word/2010/wordprocessingDrawing" xmlns:wp="http://schemas.openxmlformats.org/drawingml/2006/wordprocessingDrawing" xmlns:w10="urn:schemas-microsoft-com:office:word" xmlns:w="http://schemas.openxmlformats.org/wordprocessingml/2006/main" xmlns:w14="http://schemas.microsoft.com/office/word/2010/wordml" xmlns:w15="http://schemas.microsoft.com/office/word/2012/wordml" xmlns:w16cex="http://schemas.microsoft.com/office/word/2018/wordml/cex" xmlns:w16cid="http://schemas.microsoft.com/office/word/2016/wordml/cid" xmlns:w16="http://schemas.microsoft.com/office/word/2018/wordml" xmlns:w16du="http://schemas.microsoft.com/office/word/2023/wordml/word16du" xmlns:w16sdtdh="http://schemas.microsoft.com/office/word/2020/wordml/sdtdatahash" xmlns:w16sdtfl="http://schemas.microsoft.com/office/word/2024/wordml/sdtformatlock" xmlns:w16se="http://schemas.microsoft.com/office/word/2015/wordml/symex" xmlns:wpg="http://schemas.microsoft.com/office/word/2010/wordprocessingGroup" xmlns:wpi="http://schemas.microsoft.com/office/word/2010/wordprocessingInk" xmlns:wne="http://schemas.microsoft.com/office/word/2006/wordml" xmlns:wps="http://schemas.microsoft.com/office/word/2010/wordprocessingShape" mc:Ignorable="w14 w15 w16se w16cid w16 w16cex w16sdtdh w16sdtfl w16du wp14">
+<w:hdr xmlns:wpc="http://schemas.microsoft.com/office/word/2010/wordprocessingCanvas" xmlns:cx="http://schemas.microsoft.com/office/drawing/2014/chartex" xmlns:cx1="http://schemas.microsoft.com/office/drawing/2015/9/8/chartex" xmlns:cx2="http://schemas.microsoft.com/office/drawing/2015/10/21/chartex" xmlns:cx3="http://schemas.microsoft.com/office/drawing/2016/5/9/chartex" xmlns:cx4="http://schemas.microsoft.com/office/drawing/2016/5/10/chartex" xmlns:cx5="http://schemas.microsoft.com/office/drawing/2016/5/11/chartex" xmlns:cx6="http://schemas.microsoft.com/office/drawing/2016/5/12/chartex" xmlns:cx7="http://schemas.microsoft.com/office/drawing/2016/5/13/chartex" xmlns:cx8="http://schemas.microsoft.com/office/drawing/2016/5/14/chartex" xmlns:mc="http://schemas.openxmlformats.org/markup-compatibility/2006" xmlns:aink="http://schemas.microsoft.com/office/drawing/2016/ink" xmlns:am3d="http://schemas.microsoft.com/office/drawing/2017/model3d" xmlns:o="urn:schemas-microsoft-com:office:office" xmlns:r="http://schemas.openxmlformats.org/officeDocument/2006/relationships" xmlns:m="http://schemas.openxmlformats.org/officeDocument/2006/math" xmlns:v="urn:schemas-microsoft-com:vml" xmlns:wp14="http://schemas.microsoft.com/office/word/2010/wordprocessingDrawing" xmlns:wp="http://schemas.openxmlformats.org/drawingml/2006/wordprocessingDrawing" xmlns:w10="urn:schemas-microsoft-com:office:word" xmlns:w="http://schemas.openxmlformats.org/wordprocessingml/2006/main" xmlns:w14="http://schemas.microsoft.com/office/word/2010/wordml" xmlns:w15="http://schemas.microsoft.com/office/word/2012/wordml" xmlns:w16cex="http://schemas.microsoft.com/office/word/2018/wordml/cex" xmlns:w16cid="http://schemas.microsoft.com/office/word/2016/wordml/cid" xmlns:w16="http://schemas.microsoft.com/office/word/2018/wordml" xmlns:w16sdtdh="http://schemas.microsoft.com/office/word/2020/wordml/sdtdatahash" xmlns:w16se="http://schemas.microsoft.com/office/word/2015/wordml/symex" xmlns:wpg="http://schemas.microsoft.com/office/word/2010/wordprocessingGroup" xmlns:wpi="http://schemas.microsoft.com/office/word/2010/wordprocessingInk" xmlns:wne="http://schemas.microsoft.com/office/word/2006/wordml" xmlns:wps="http://schemas.microsoft.com/office/word/2010/wordprocessingShape" mc:Ignorable="w14 w15 w16se w16cid w16 w16cex w16sdtdh wp14">
   <w:p>
     <w:pPr>
       <w:pBdr>
@@ -5144,7 +5263,7 @@
 </file>
 
 <file path=word/numbering.xml><?xml version="1.0" encoding="utf-8"?>
-<w:numbering xmlns:wpc="http://schemas.microsoft.com/office/word/2010/wordprocessingCanvas" xmlns:cx="http://schemas.microsoft.com/office/drawing/2014/chartex" xmlns:cx1="http://schemas.microsoft.com/office/drawing/2015/9/8/chartex" xmlns:cx2="http://schemas.microsoft.com/office/drawing/2015/10/21/chartex" xmlns:cx3="http://schemas.microsoft.com/office/drawing/2016/5/9/chartex" xmlns:cx4="http://schemas.microsoft.com/office/drawing/2016/5/10/chartex" xmlns:cx5="http://schemas.microsoft.com/office/drawing/2016/5/11/chartex" xmlns:cx6="http://schemas.microsoft.com/office/drawing/2016/5/12/chartex" xmlns:cx7="http://schemas.microsoft.com/office/drawing/2016/5/13/chartex" xmlns:cx8="http://schemas.microsoft.com/office/drawing/2016/5/14/chartex" xmlns:mc="http://schemas.openxmlformats.org/markup-compatibility/2006" xmlns:aink="http://schemas.microsoft.com/office/drawing/2016/ink" xmlns:am3d="http://schemas.microsoft.com/office/drawing/2017/model3d" xmlns:o="urn:schemas-microsoft-com:office:office" xmlns:oel="http://schemas.microsoft.com/office/2019/extlst" xmlns:r="http://schemas.openxmlformats.org/officeDocument/2006/relationships" xmlns:m="http://schemas.openxmlformats.org/officeDocument/2006/math" xmlns:v="urn:schemas-microsoft-com:vml" xmlns:wp14="http://schemas.microsoft.com/office/word/2010/wordprocessingDrawing" xmlns:wp="http://schemas.openxmlformats.org/drawingml/2006/wordprocessingDrawing" xmlns:w10="urn:schemas-microsoft-com:office:word" xmlns:w="http://schemas.openxmlformats.org/wordprocessingml/2006/main" xmlns:w14="http://schemas.microsoft.com/office/word/2010/wordml" xmlns:w15="http://schemas.microsoft.com/office/word/2012/wordml" xmlns:w16cex="http://schemas.microsoft.com/office/word/2018/wordml/cex" xmlns:w16cid="http://schemas.microsoft.com/office/word/2016/wordml/cid" xmlns:w16="http://schemas.microsoft.com/office/word/2018/wordml" xmlns:w16du="http://schemas.microsoft.com/office/word/2023/wordml/word16du" xmlns:w16sdtdh="http://schemas.microsoft.com/office/word/2020/wordml/sdtdatahash" xmlns:w16sdtfl="http://schemas.microsoft.com/office/word/2024/wordml/sdtformatlock" xmlns:w16se="http://schemas.microsoft.com/office/word/2015/wordml/symex" xmlns:wpg="http://schemas.microsoft.com/office/word/2010/wordprocessingGroup" xmlns:wpi="http://schemas.microsoft.com/office/word/2010/wordprocessingInk" xmlns:wne="http://schemas.microsoft.com/office/word/2006/wordml" xmlns:wps="http://schemas.microsoft.com/office/word/2010/wordprocessingShape" mc:Ignorable="w14 w15 w16se w16cid w16 w16cex w16sdtdh w16sdtfl w16du wp14">
+<w:numbering xmlns:wpc="http://schemas.microsoft.com/office/word/2010/wordprocessingCanvas" xmlns:cx="http://schemas.microsoft.com/office/drawing/2014/chartex" xmlns:cx1="http://schemas.microsoft.com/office/drawing/2015/9/8/chartex" xmlns:cx2="http://schemas.microsoft.com/office/drawing/2015/10/21/chartex" xmlns:cx3="http://schemas.microsoft.com/office/drawing/2016/5/9/chartex" xmlns:cx4="http://schemas.microsoft.com/office/drawing/2016/5/10/chartex" xmlns:cx5="http://schemas.microsoft.com/office/drawing/2016/5/11/chartex" xmlns:cx6="http://schemas.microsoft.com/office/drawing/2016/5/12/chartex" xmlns:cx7="http://schemas.microsoft.com/office/drawing/2016/5/13/chartex" xmlns:cx8="http://schemas.microsoft.com/office/drawing/2016/5/14/chartex" xmlns:mc="http://schemas.openxmlformats.org/markup-compatibility/2006" xmlns:aink="http://schemas.microsoft.com/office/drawing/2016/ink" xmlns:am3d="http://schemas.microsoft.com/office/drawing/2017/model3d" xmlns:o="urn:schemas-microsoft-com:office:office" xmlns:r="http://schemas.openxmlformats.org/officeDocument/2006/relationships" xmlns:m="http://schemas.openxmlformats.org/officeDocument/2006/math" xmlns:v="urn:schemas-microsoft-com:vml" xmlns:wp14="http://schemas.microsoft.com/office/word/2010/wordprocessingDrawing" xmlns:wp="http://schemas.openxmlformats.org/drawingml/2006/wordprocessingDrawing" xmlns:w10="urn:schemas-microsoft-com:office:word" xmlns:w="http://schemas.openxmlformats.org/wordprocessingml/2006/main" xmlns:w14="http://schemas.microsoft.com/office/word/2010/wordml" xmlns:w15="http://schemas.microsoft.com/office/word/2012/wordml" xmlns:w16cex="http://schemas.microsoft.com/office/word/2018/wordml/cex" xmlns:w16cid="http://schemas.microsoft.com/office/word/2016/wordml/cid" xmlns:w16="http://schemas.microsoft.com/office/word/2018/wordml" xmlns:w16sdtdh="http://schemas.microsoft.com/office/word/2020/wordml/sdtdatahash" xmlns:w16se="http://schemas.microsoft.com/office/word/2015/wordml/symex" xmlns:wpg="http://schemas.microsoft.com/office/word/2010/wordprocessingGroup" xmlns:wpi="http://schemas.microsoft.com/office/word/2010/wordprocessingInk" xmlns:wne="http://schemas.microsoft.com/office/word/2006/wordml" xmlns:wps="http://schemas.microsoft.com/office/word/2010/wordprocessingShape" mc:Ignorable="w14 w15 w16se w16cid w16 w16cex w16sdtdh wp14">
   <w:abstractNum w:abstractNumId="0" w15:restartNumberingAfterBreak="0">
     <w:nsid w:val="0AFF1831"/>
     <w:multiLevelType w:val="multilevel"/>
@@ -7169,80 +7288,80 @@
       </w:pPr>
     </w:lvl>
   </w:abstractNum>
-  <w:num w:numId="1" w16cid:durableId="931547272">
+  <w:num w:numId="1">
     <w:abstractNumId w:val="20"/>
   </w:num>
-  <w:num w:numId="2" w16cid:durableId="1293904642">
+  <w:num w:numId="2">
     <w:abstractNumId w:val="22"/>
   </w:num>
-  <w:num w:numId="3" w16cid:durableId="725837796">
+  <w:num w:numId="3">
     <w:abstractNumId w:val="5"/>
   </w:num>
-  <w:num w:numId="4" w16cid:durableId="24450595">
+  <w:num w:numId="4">
     <w:abstractNumId w:val="9"/>
   </w:num>
-  <w:num w:numId="5" w16cid:durableId="1499494488">
+  <w:num w:numId="5">
     <w:abstractNumId w:val="15"/>
   </w:num>
-  <w:num w:numId="6" w16cid:durableId="1890725338">
+  <w:num w:numId="6">
     <w:abstractNumId w:val="11"/>
   </w:num>
-  <w:num w:numId="7" w16cid:durableId="1149663774">
+  <w:num w:numId="7">
     <w:abstractNumId w:val="7"/>
   </w:num>
-  <w:num w:numId="8" w16cid:durableId="1243296453">
+  <w:num w:numId="8">
     <w:abstractNumId w:val="16"/>
   </w:num>
-  <w:num w:numId="9" w16cid:durableId="1352225904">
+  <w:num w:numId="9">
     <w:abstractNumId w:val="10"/>
   </w:num>
-  <w:num w:numId="10" w16cid:durableId="364255202">
+  <w:num w:numId="10">
     <w:abstractNumId w:val="3"/>
   </w:num>
-  <w:num w:numId="11" w16cid:durableId="781803432">
+  <w:num w:numId="11">
     <w:abstractNumId w:val="8"/>
   </w:num>
-  <w:num w:numId="12" w16cid:durableId="2011525483">
+  <w:num w:numId="12">
     <w:abstractNumId w:val="13"/>
   </w:num>
-  <w:num w:numId="13" w16cid:durableId="1325667569">
+  <w:num w:numId="13">
     <w:abstractNumId w:val="4"/>
   </w:num>
-  <w:num w:numId="14" w16cid:durableId="1036737040">
+  <w:num w:numId="14">
     <w:abstractNumId w:val="18"/>
   </w:num>
-  <w:num w:numId="15" w16cid:durableId="239145393">
+  <w:num w:numId="15">
     <w:abstractNumId w:val="1"/>
   </w:num>
-  <w:num w:numId="16" w16cid:durableId="1660310570">
+  <w:num w:numId="16">
     <w:abstractNumId w:val="14"/>
   </w:num>
-  <w:num w:numId="17" w16cid:durableId="1225944241">
+  <w:num w:numId="17">
     <w:abstractNumId w:val="6"/>
   </w:num>
-  <w:num w:numId="18" w16cid:durableId="1245535137">
+  <w:num w:numId="18">
     <w:abstractNumId w:val="12"/>
   </w:num>
-  <w:num w:numId="19" w16cid:durableId="1784886629">
+  <w:num w:numId="19">
     <w:abstractNumId w:val="2"/>
   </w:num>
-  <w:num w:numId="20" w16cid:durableId="926886412">
+  <w:num w:numId="20">
     <w:abstractNumId w:val="19"/>
   </w:num>
-  <w:num w:numId="21" w16cid:durableId="1642340811">
+  <w:num w:numId="21">
     <w:abstractNumId w:val="17"/>
   </w:num>
-  <w:num w:numId="22" w16cid:durableId="1037851858">
+  <w:num w:numId="22">
     <w:abstractNumId w:val="0"/>
   </w:num>
-  <w:num w:numId="23" w16cid:durableId="1481923766">
+  <w:num w:numId="23">
     <w:abstractNumId w:val="21"/>
   </w:num>
 </w:numbering>
 </file>
 
 <file path=word/styles.xml><?xml version="1.0" encoding="utf-8"?>
-<w:styles xmlns:mc="http://schemas.openxmlformats.org/markup-compatibility/2006" xmlns:r="http://schemas.openxmlformats.org/officeDocument/2006/relationships" xmlns:w="http://schemas.openxmlformats.org/wordprocessingml/2006/main" xmlns:w14="http://schemas.microsoft.com/office/word/2010/wordml" xmlns:w15="http://schemas.microsoft.com/office/word/2012/wordml" xmlns:w16cex="http://schemas.microsoft.com/office/word/2018/wordml/cex" xmlns:w16cid="http://schemas.microsoft.com/office/word/2016/wordml/cid" xmlns:w16="http://schemas.microsoft.com/office/word/2018/wordml" xmlns:w16du="http://schemas.microsoft.com/office/word/2023/wordml/word16du" xmlns:w16sdtdh="http://schemas.microsoft.com/office/word/2020/wordml/sdtdatahash" xmlns:w16sdtfl="http://schemas.microsoft.com/office/word/2024/wordml/sdtformatlock" xmlns:w16se="http://schemas.microsoft.com/office/word/2015/wordml/symex" mc:Ignorable="w14 w15 w16se w16cid w16 w16cex w16sdtdh w16sdtfl w16du">
+<w:styles xmlns:mc="http://schemas.openxmlformats.org/markup-compatibility/2006" xmlns:r="http://schemas.openxmlformats.org/officeDocument/2006/relationships" xmlns:w="http://schemas.openxmlformats.org/wordprocessingml/2006/main" xmlns:w14="http://schemas.microsoft.com/office/word/2010/wordml" xmlns:w15="http://schemas.microsoft.com/office/word/2012/wordml" xmlns:w16cex="http://schemas.microsoft.com/office/word/2018/wordml/cex" xmlns:w16cid="http://schemas.microsoft.com/office/word/2016/wordml/cid" xmlns:w16="http://schemas.microsoft.com/office/word/2018/wordml" xmlns:w16sdtdh="http://schemas.microsoft.com/office/word/2020/wordml/sdtdatahash" xmlns:w16se="http://schemas.microsoft.com/office/word/2015/wordml/symex" mc:Ignorable="w14 w15 w16se w16cid w16 w16cex w16sdtdh">
   <w:docDefaults>
     <w:rPrDefault>
       <w:rPr>
@@ -8390,12 +8509,21 @@
 </file>
 
 <file path=customXml/item1.xml><?xml version="1.0" encoding="utf-8"?>
+<?mso-contentType ?>
+<FormTemplates xmlns="http://schemas.microsoft.com/sharepoint/v3/contenttype/forms">
+  <Display>DocumentLibraryForm</Display>
+  <Edit>DocumentLibraryForm</Edit>
+  <New>DocumentLibraryForm</New>
+</FormTemplates>
+</file>
+
+<file path=customXml/item2.xml><?xml version="1.0" encoding="utf-8"?>
 <go:gDocsCustomXmlDataStorage xmlns:go="http://customooxmlschemas.google.com/" xmlns:r="http://schemas.openxmlformats.org/officeDocument/2006/relationships" uri="GoogleDocsCustomDataVersion2">
   <go:docsCustomData xmlns:go="http://customooxmlschemas.google.com/" roundtripDataSignature="AMtx7mjn9cawKyTC0i60swaztKha3zjFPw==">CgMxLjA4AHIhMVZqQ0ZiaWxTSmJvdWJYcWU2aXNrLU1aX0tQNXBOVHpN</go:docsCustomData>
 </go:gDocsCustomXmlDataStorage>
 </file>
 
-<file path=customXml/item2.xml><?xml version="1.0" encoding="utf-8"?>
+<file path=customXml/item3.xml><?xml version="1.0" encoding="utf-8"?>
 <ct:contentTypeSchema xmlns:ct="http://schemas.microsoft.com/office/2006/metadata/contentType" xmlns:ma="http://schemas.microsoft.com/office/2006/metadata/properties/metaAttributes" ct:_="" ma:_="" ma:contentTypeName="Document" ma:contentTypeID="0x01010002AFD966774140449DCACCFF674A8819" ma:contentTypeVersion="15" ma:contentTypeDescription="Create a new document." ma:contentTypeScope="" ma:versionID="f911e2bccde1c45c2c927962860c80c0">
   <xsd:schema xmlns:xsd="http://www.w3.org/2001/XMLSchema" xmlns:xs="http://www.w3.org/2001/XMLSchema" xmlns:p="http://schemas.microsoft.com/office/2006/metadata/properties" xmlns:ns2="592ddb0a-d8df-4d9e-9d2c-6d0cc5766fc8" xmlns:ns3="e115b942-9458-402f-a764-ecead2ccf342" targetNamespace="http://schemas.microsoft.com/office/2006/metadata/properties" ma:root="true" ma:fieldsID="367ae541f56999171146a51cab8fd401" ns2:_="" ns3:_="">
     <xsd:import namespace="592ddb0a-d8df-4d9e-9d2c-6d0cc5766fc8"/>
@@ -8630,15 +8758,6 @@
 </ct:contentTypeSchema>
 </file>
 
-<file path=customXml/item3.xml><?xml version="1.0" encoding="utf-8"?>
-<?mso-contentType ?>
-<FormTemplates xmlns="http://schemas.microsoft.com/sharepoint/v3/contenttype/forms">
-  <Display>DocumentLibraryForm</Display>
-  <Edit>DocumentLibraryForm</Edit>
-  <New>DocumentLibraryForm</New>
-</FormTemplates>
-</file>
-
 <file path=customXml/item4.xml><?xml version="1.0" encoding="utf-8"?>
 <p:properties xmlns:p="http://schemas.microsoft.com/office/2006/metadata/properties" xmlns:xsi="http://www.w3.org/2001/XMLSchema-instance" xmlns:pc="http://schemas.microsoft.com/office/infopath/2007/PartnerControls">
   <documentManagement>
@@ -8651,6 +8770,14 @@
 </file>
 
 <file path=customXml/itemProps1.xml><?xml version="1.0" encoding="utf-8"?>
+<ds:datastoreItem xmlns:ds="http://schemas.openxmlformats.org/officeDocument/2006/customXml" ds:itemID="{ECC7AEC2-7A6F-4C4A-96E9-5A464D2C259A}">
+  <ds:schemaRefs>
+    <ds:schemaRef ds:uri="http://schemas.microsoft.com/sharepoint/v3/contenttype/forms"/>
+  </ds:schemaRefs>
+</ds:datastoreItem>
+</file>
+
+<file path=customXml/itemProps2.xml><?xml version="1.0" encoding="utf-8"?>
 <ds:datastoreItem xmlns:ds="http://schemas.openxmlformats.org/officeDocument/2006/customXml" ds:itemID="{11111111-1234-1234-1234-123412341234}">
   <ds:schemaRefs>
     <ds:schemaRef ds:uri="http://customooxmlschemas.google.com/"/>
@@ -8659,14 +8786,32 @@
 </ds:datastoreItem>
 </file>
 
-<file path=customXml/itemProps2.xml><?xml version="1.0" encoding="utf-8"?>
-<ds:datastoreItem xmlns:ds="http://schemas.openxmlformats.org/officeDocument/2006/customXml" ds:itemID="{B9C86F96-2E13-404E-83E4-7B1E5F6BC538}"/>
-</file>
-
 <file path=customXml/itemProps3.xml><?xml version="1.0" encoding="utf-8"?>
-<ds:datastoreItem xmlns:ds="http://schemas.openxmlformats.org/officeDocument/2006/customXml" ds:itemID="{ECC7AEC2-7A6F-4C4A-96E9-5A464D2C259A}"/>
+<ds:datastoreItem xmlns:ds="http://schemas.openxmlformats.org/officeDocument/2006/customXml" ds:itemID="{B9C86F96-2E13-404E-83E4-7B1E5F6BC538}">
+  <ds:schemaRefs>
+    <ds:schemaRef ds:uri="http://schemas.microsoft.com/office/2006/metadata/contentType"/>
+    <ds:schemaRef ds:uri="http://schemas.microsoft.com/office/2006/metadata/properties/metaAttributes"/>
+    <ds:schemaRef ds:uri="http://www.w3.org/2001/XMLSchema"/>
+    <ds:schemaRef ds:uri="http://schemas.microsoft.com/office/2006/metadata/properties"/>
+    <ds:schemaRef ds:uri="592ddb0a-d8df-4d9e-9d2c-6d0cc5766fc8"/>
+    <ds:schemaRef ds:uri="e115b942-9458-402f-a764-ecead2ccf342"/>
+    <ds:schemaRef ds:uri="http://schemas.microsoft.com/office/2006/documentManagement/types"/>
+    <ds:schemaRef ds:uri="http://schemas.microsoft.com/office/infopath/2007/PartnerControls"/>
+    <ds:schemaRef ds:uri="http://schemas.openxmlformats.org/package/2006/metadata/core-properties"/>
+    <ds:schemaRef ds:uri="http://purl.org/dc/elements/1.1/"/>
+    <ds:schemaRef ds:uri="http://purl.org/dc/terms/"/>
+    <ds:schemaRef ds:uri="http://schemas.microsoft.com/internal/obd"/>
+  </ds:schemaRefs>
+</ds:datastoreItem>
 </file>
 
 <file path=customXml/itemProps4.xml><?xml version="1.0" encoding="utf-8"?>
-<ds:datastoreItem xmlns:ds="http://schemas.openxmlformats.org/officeDocument/2006/customXml" ds:itemID="{A2D4FD29-1A44-42A0-9D41-39467705DB30}"/>
+<ds:datastoreItem xmlns:ds="http://schemas.openxmlformats.org/officeDocument/2006/customXml" ds:itemID="{A2D4FD29-1A44-42A0-9D41-39467705DB30}">
+  <ds:schemaRefs>
+    <ds:schemaRef ds:uri="http://schemas.microsoft.com/office/2006/metadata/properties"/>
+    <ds:schemaRef ds:uri="http://schemas.microsoft.com/office/infopath/2007/PartnerControls"/>
+    <ds:schemaRef ds:uri="e115b942-9458-402f-a764-ecead2ccf342"/>
+    <ds:schemaRef ds:uri="592ddb0a-d8df-4d9e-9d2c-6d0cc5766fc8"/>
+  </ds:schemaRefs>
+</ds:datastoreItem>
 </file>
</xml_diff>

<commit_message>
fix: simplify PIHAK KEDUA correspondence block, drop dead Alamat Instansi field
Pasal 12 (Korespondensi) listed PIHAK KEDUA as signatoryTitle + institutionName
plus an {{institutionAddress}} placeholder and a hardcoded "Telp. (021) 29600000"
line. Per request, trimmed the block down to just the title and institution name.
Also removes the now-unused "Alamat Instansi Klien (Pihak Kedua)" input, its state,
and its data/FIELD_LABELS wiring in the docx generator since the template no longer
has a placeholder for it.
</commit_message>
<xml_diff>
--- a/public/PRJ_Template_Placeholder.docx
+++ b/public/PRJ_Template_Placeholder.docx
@@ -4031,49 +4031,6 @@
           <w:highlight w:val="yellow"/>
         </w:rPr>
         <w:t>{{institutionName}}</w:t>
-      </w:r>
-    </w:p>
-    <w:p>
-      <w:pPr>
-        <w:spacing w:before="120" w:after="0" w:line="252" w:lineRule="auto"/>
-        <w:ind w:left="900" w:hanging="180"/>
-        <w:jc w:val="both"/>
-        <w:rPr>
-          <w:rFonts w:ascii="Arial" w:eastAsia="Arial" w:hAnsi="Arial" w:cs="Arial"/>
-          <w:sz w:val="16"/>
-          <w:szCs w:val="16"/>
-          <w:highlight w:val="yellow"/>
-        </w:rPr>
-      </w:pPr>
-      <w:r>
-        <w:rPr>
-          <w:rFonts w:ascii="Arial" w:eastAsia="Arial" w:hAnsi="Arial" w:cs="Arial"/>
-          <w:sz w:val="16"/>
-          <w:szCs w:val="16"/>
-          <w:highlight w:val="yellow"/>
-        </w:rPr>
-        <w:t>{{institutionAddress}}</w:t>
-      </w:r>
-    </w:p>
-    <w:p>
-      <w:pPr>
-        <w:spacing w:before="120" w:line="252" w:lineRule="auto"/>
-        <w:ind w:left="900" w:hanging="180"/>
-        <w:jc w:val="both"/>
-        <w:rPr>
-          <w:rFonts w:ascii="Arial" w:eastAsia="Arial" w:hAnsi="Arial" w:cs="Arial"/>
-          <w:sz w:val="16"/>
-          <w:szCs w:val="16"/>
-        </w:rPr>
-      </w:pPr>
-      <w:r>
-        <w:rPr>
-          <w:rFonts w:ascii="Arial" w:eastAsia="Arial" w:hAnsi="Arial" w:cs="Arial"/>
-          <w:sz w:val="16"/>
-          <w:szCs w:val="16"/>
-          <w:highlight w:val="yellow"/>
-        </w:rPr>
-        <w:t>Telp. (021) 29600000</w:t>
       </w:r>
     </w:p>
     <w:p>

</xml_diff>